<commit_message>
Feedback from Manu and STefan
</commit_message>
<xml_diff>
--- a/manuscript/OSF_repository/Supplemental_Tables.docx
+++ b/manuscript/OSF_repository/Supplemental_Tables.docx
@@ -467,9 +467,27 @@
                 <w:szCs w:val="24"/>
                 <w:lang w:val="en-US" w:eastAsia="de-DE"/>
               </w:rPr>
-              <w:t>ang</w:t>
-            </w:r>
-            <w:r>
+              <w:t>anger</w:t>
+            </w:r>
+          </w:p>
+        </w:tc>
+        <w:tc>
+          <w:tcPr>
+            <w:tcW w:w="1200" w:type="dxa"/>
+            <w:tcBorders>
+              <w:top w:val="single" w:sz="4" w:space="0" w:color="auto"/>
+              <w:left w:val="nil"/>
+              <w:bottom w:val="single" w:sz="4" w:space="0" w:color="auto"/>
+              <w:right w:val="nil"/>
+            </w:tcBorders>
+            <w:noWrap/>
+            <w:vAlign w:val="bottom"/>
+            <w:hideMark/>
+          </w:tcPr>
+          <w:p>
+            <w:pPr>
+              <w:spacing w:after="0" w:line="240" w:lineRule="auto"/>
+              <w:jc w:val="center"/>
               <w:rPr>
                 <w:rFonts w:eastAsia="Times New Roman" w:cs="Calibri"/>
                 <w:b/>
@@ -479,27 +497,8 @@
                 <w:szCs w:val="24"/>
                 <w:lang w:val="en-US" w:eastAsia="de-DE"/>
               </w:rPr>
-              <w:t>er</w:t>
-            </w:r>
-          </w:p>
-        </w:tc>
-        <w:tc>
-          <w:tcPr>
-            <w:tcW w:w="1200" w:type="dxa"/>
-            <w:tcBorders>
-              <w:top w:val="single" w:sz="4" w:space="0" w:color="auto"/>
-              <w:left w:val="nil"/>
-              <w:bottom w:val="single" w:sz="4" w:space="0" w:color="auto"/>
-              <w:right w:val="nil"/>
-            </w:tcBorders>
-            <w:noWrap/>
-            <w:vAlign w:val="bottom"/>
-            <w:hideMark/>
-          </w:tcPr>
-          <w:p>
-            <w:pPr>
-              <w:spacing w:after="0" w:line="240" w:lineRule="auto"/>
-              <w:jc w:val="center"/>
+            </w:pPr>
+            <w:r>
               <w:rPr>
                 <w:rFonts w:eastAsia="Times New Roman" w:cs="Calibri"/>
                 <w:b/>
@@ -509,8 +508,27 @@
                 <w:szCs w:val="24"/>
                 <w:lang w:val="en-US" w:eastAsia="de-DE"/>
               </w:rPr>
-            </w:pPr>
-            <w:r>
+              <w:t>fear</w:t>
+            </w:r>
+          </w:p>
+        </w:tc>
+        <w:tc>
+          <w:tcPr>
+            <w:tcW w:w="1160" w:type="dxa"/>
+            <w:tcBorders>
+              <w:top w:val="nil"/>
+              <w:left w:val="nil"/>
+              <w:bottom w:val="single" w:sz="4" w:space="0" w:color="auto"/>
+              <w:right w:val="nil"/>
+            </w:tcBorders>
+            <w:noWrap/>
+            <w:vAlign w:val="bottom"/>
+            <w:hideMark/>
+          </w:tcPr>
+          <w:p>
+            <w:pPr>
+              <w:spacing w:after="0" w:line="240" w:lineRule="auto"/>
+              <w:jc w:val="center"/>
               <w:rPr>
                 <w:rFonts w:eastAsia="Times New Roman" w:cs="Calibri"/>
                 <w:b/>
@@ -520,8 +538,7 @@
                 <w:szCs w:val="24"/>
                 <w:lang w:val="en-US" w:eastAsia="de-DE"/>
               </w:rPr>
-              <w:t>fea</w:t>
-            </w:r>
+            </w:pPr>
             <w:r>
               <w:rPr>
                 <w:rFonts w:eastAsia="Times New Roman" w:cs="Calibri"/>
@@ -532,7 +549,7 @@
                 <w:szCs w:val="24"/>
                 <w:lang w:val="en-US" w:eastAsia="de-DE"/>
               </w:rPr>
-              <w:t>r</w:t>
+              <w:t>anger</w:t>
             </w:r>
           </w:p>
         </w:tc>
@@ -573,72 +590,7 @@
                 <w:szCs w:val="24"/>
                 <w:lang w:val="en-US" w:eastAsia="de-DE"/>
               </w:rPr>
-              <w:t>ang</w:t>
-            </w:r>
-            <w:r>
-              <w:rPr>
-                <w:rFonts w:eastAsia="Times New Roman" w:cs="Calibri"/>
-                <w:b/>
-                <w:bCs/>
-                <w:color w:val="000000"/>
-                <w:sz w:val="24"/>
-                <w:szCs w:val="24"/>
-                <w:lang w:val="en-US" w:eastAsia="de-DE"/>
-              </w:rPr>
-              <w:t>er</w:t>
-            </w:r>
-          </w:p>
-        </w:tc>
-        <w:tc>
-          <w:tcPr>
-            <w:tcW w:w="1160" w:type="dxa"/>
-            <w:tcBorders>
-              <w:top w:val="nil"/>
-              <w:left w:val="nil"/>
-              <w:bottom w:val="single" w:sz="4" w:space="0" w:color="auto"/>
-              <w:right w:val="nil"/>
-            </w:tcBorders>
-            <w:noWrap/>
-            <w:vAlign w:val="bottom"/>
-            <w:hideMark/>
-          </w:tcPr>
-          <w:p>
-            <w:pPr>
-              <w:spacing w:after="0" w:line="240" w:lineRule="auto"/>
-              <w:jc w:val="center"/>
-              <w:rPr>
-                <w:rFonts w:eastAsia="Times New Roman" w:cs="Calibri"/>
-                <w:b/>
-                <w:bCs/>
-                <w:color w:val="000000"/>
-                <w:sz w:val="24"/>
-                <w:szCs w:val="24"/>
-                <w:lang w:val="en-US" w:eastAsia="de-DE"/>
-              </w:rPr>
-            </w:pPr>
-            <w:r>
-              <w:rPr>
-                <w:rFonts w:eastAsia="Times New Roman" w:cs="Calibri"/>
-                <w:b/>
-                <w:bCs/>
-                <w:color w:val="000000"/>
-                <w:sz w:val="24"/>
-                <w:szCs w:val="24"/>
-                <w:lang w:val="en-US" w:eastAsia="de-DE"/>
-              </w:rPr>
-              <w:t>fea</w:t>
-            </w:r>
-            <w:r>
-              <w:rPr>
-                <w:rFonts w:eastAsia="Times New Roman" w:cs="Calibri"/>
-                <w:b/>
-                <w:bCs/>
-                <w:color w:val="000000"/>
-                <w:sz w:val="24"/>
-                <w:szCs w:val="24"/>
-                <w:lang w:val="en-US" w:eastAsia="de-DE"/>
-              </w:rPr>
-              <w:t>r</w:t>
+              <w:t>fear</w:t>
             </w:r>
           </w:p>
         </w:tc>
@@ -665,8 +617,6 @@
               <w:spacing w:after="0" w:line="240" w:lineRule="auto"/>
               <w:rPr>
                 <w:rFonts w:eastAsia="Times New Roman" w:cs="Calibri"/>
-                <w:i/>
-                <w:iCs/>
                 <w:color w:val="000000"/>
                 <w:sz w:val="24"/>
                 <w:szCs w:val="24"/>
@@ -676,11 +626,10 @@
             <w:r>
               <w:rPr>
                 <w:rFonts w:cs="Calibri"/>
-                <w:i/>
-                <w:iCs/>
                 <w:color w:val="000000"/>
                 <w:sz w:val="24"/>
                 <w:szCs w:val="24"/>
+                <w:lang w:val="en-US"/>
               </w:rPr>
               <w:t>F0 Mean</w:t>
             </w:r>
@@ -717,6 +666,7 @@
                 <w:color w:val="000000"/>
                 <w:sz w:val="24"/>
                 <w:szCs w:val="24"/>
+                <w:lang w:val="en-US"/>
               </w:rPr>
               <w:t>366</w:t>
             </w:r>
@@ -753,6 +703,7 @@
                 <w:color w:val="000000"/>
                 <w:sz w:val="24"/>
                 <w:szCs w:val="24"/>
+                <w:lang w:val="en-US"/>
               </w:rPr>
               <w:t>288</w:t>
             </w:r>
@@ -789,6 +740,7 @@
                 <w:color w:val="000000"/>
                 <w:sz w:val="24"/>
                 <w:szCs w:val="24"/>
+                <w:lang w:val="en-US"/>
               </w:rPr>
               <w:t>264</w:t>
             </w:r>
@@ -825,6 +777,7 @@
                 <w:color w:val="000000"/>
                 <w:sz w:val="24"/>
                 <w:szCs w:val="24"/>
+                <w:lang w:val="en-US"/>
               </w:rPr>
               <w:t>205</w:t>
             </w:r>
@@ -853,8 +806,6 @@
               <w:spacing w:after="0" w:line="240" w:lineRule="auto"/>
               <w:rPr>
                 <w:rFonts w:eastAsia="Times New Roman" w:cs="Calibri"/>
-                <w:i/>
-                <w:iCs/>
                 <w:color w:val="000000"/>
                 <w:sz w:val="24"/>
                 <w:szCs w:val="24"/>
@@ -864,11 +815,10 @@
             <w:r>
               <w:rPr>
                 <w:rFonts w:cs="Calibri"/>
-                <w:i/>
-                <w:iCs/>
                 <w:color w:val="000000"/>
                 <w:sz w:val="24"/>
                 <w:szCs w:val="24"/>
+                <w:lang w:val="en-US"/>
               </w:rPr>
               <w:t>F0 SD</w:t>
             </w:r>
@@ -905,6 +855,7 @@
                 <w:color w:val="000000"/>
                 <w:sz w:val="24"/>
                 <w:szCs w:val="24"/>
+                <w:lang w:val="en-US"/>
               </w:rPr>
               <w:t>67</w:t>
             </w:r>
@@ -941,6 +892,7 @@
                 <w:color w:val="000000"/>
                 <w:sz w:val="24"/>
                 <w:szCs w:val="24"/>
+                <w:lang w:val="en-US"/>
               </w:rPr>
               <w:t>19</w:t>
             </w:r>
@@ -977,6 +929,7 @@
                 <w:color w:val="000000"/>
                 <w:sz w:val="24"/>
                 <w:szCs w:val="24"/>
+                <w:lang w:val="en-US"/>
               </w:rPr>
               <w:t>46</w:t>
             </w:r>
@@ -1013,6 +966,7 @@
                 <w:color w:val="000000"/>
                 <w:sz w:val="24"/>
                 <w:szCs w:val="24"/>
+                <w:lang w:val="en-US"/>
               </w:rPr>
               <w:t>27</w:t>
             </w:r>
@@ -1041,8 +995,6 @@
               <w:spacing w:after="0" w:line="240" w:lineRule="auto"/>
               <w:rPr>
                 <w:rFonts w:eastAsia="Times New Roman" w:cs="Calibri"/>
-                <w:i/>
-                <w:iCs/>
                 <w:color w:val="000000"/>
                 <w:sz w:val="24"/>
                 <w:szCs w:val="24"/>
@@ -1052,11 +1004,10 @@
             <w:r>
               <w:rPr>
                 <w:rFonts w:cs="Calibri"/>
-                <w:i/>
-                <w:iCs/>
                 <w:color w:val="000000"/>
                 <w:sz w:val="24"/>
                 <w:szCs w:val="24"/>
+                <w:lang w:val="en-US"/>
               </w:rPr>
               <w:t>F0 Intonation</w:t>
             </w:r>
@@ -1093,6 +1044,7 @@
                 <w:color w:val="000000"/>
                 <w:sz w:val="24"/>
                 <w:szCs w:val="24"/>
+                <w:lang w:val="en-US"/>
               </w:rPr>
               <w:t>259</w:t>
             </w:r>
@@ -1129,6 +1081,7 @@
                 <w:color w:val="000000"/>
                 <w:sz w:val="24"/>
                 <w:szCs w:val="24"/>
+                <w:lang w:val="en-US"/>
               </w:rPr>
               <w:t>79</w:t>
             </w:r>
@@ -1165,6 +1118,7 @@
                 <w:color w:val="000000"/>
                 <w:sz w:val="24"/>
                 <w:szCs w:val="24"/>
+                <w:lang w:val="en-US"/>
               </w:rPr>
               <w:t>171</w:t>
             </w:r>
@@ -1201,6 +1155,7 @@
                 <w:color w:val="000000"/>
                 <w:sz w:val="24"/>
                 <w:szCs w:val="24"/>
+                <w:lang w:val="en-US"/>
               </w:rPr>
               <w:t>95</w:t>
             </w:r>
@@ -1229,8 +1184,6 @@
               <w:spacing w:after="0" w:line="240" w:lineRule="auto"/>
               <w:rPr>
                 <w:rFonts w:eastAsia="Times New Roman" w:cs="Calibri"/>
-                <w:i/>
-                <w:iCs/>
                 <w:color w:val="000000"/>
                 <w:sz w:val="24"/>
                 <w:szCs w:val="24"/>
@@ -1240,11 +1193,10 @@
             <w:r>
               <w:rPr>
                 <w:rFonts w:cs="Calibri"/>
-                <w:i/>
-                <w:iCs/>
                 <w:color w:val="000000"/>
                 <w:sz w:val="24"/>
                 <w:szCs w:val="24"/>
+                <w:lang w:val="en-US"/>
               </w:rPr>
               <w:t>F0 Glide</w:t>
             </w:r>
@@ -1281,6 +1233,7 @@
                 <w:color w:val="000000"/>
                 <w:sz w:val="24"/>
                 <w:szCs w:val="24"/>
+                <w:lang w:val="en-US"/>
               </w:rPr>
               <w:t>-60</w:t>
             </w:r>
@@ -1317,6 +1270,7 @@
                 <w:color w:val="000000"/>
                 <w:sz w:val="24"/>
                 <w:szCs w:val="24"/>
+                <w:lang w:val="en-US"/>
               </w:rPr>
               <w:t>3</w:t>
             </w:r>
@@ -1353,6 +1307,7 @@
                 <w:color w:val="000000"/>
                 <w:sz w:val="24"/>
                 <w:szCs w:val="24"/>
+                <w:lang w:val="en-US"/>
               </w:rPr>
               <w:t>-41</w:t>
             </w:r>
@@ -1389,6 +1344,7 @@
                 <w:color w:val="000000"/>
                 <w:sz w:val="24"/>
                 <w:szCs w:val="24"/>
+                <w:lang w:val="en-US"/>
               </w:rPr>
               <w:t>12</w:t>
             </w:r>
@@ -1417,8 +1373,6 @@
               <w:spacing w:after="0" w:line="240" w:lineRule="auto"/>
               <w:rPr>
                 <w:rFonts w:eastAsia="Times New Roman" w:cs="Calibri"/>
-                <w:i/>
-                <w:iCs/>
                 <w:color w:val="000000"/>
                 <w:sz w:val="24"/>
                 <w:szCs w:val="24"/>
@@ -1428,11 +1382,10 @@
             <w:r>
               <w:rPr>
                 <w:rFonts w:cs="Calibri"/>
-                <w:i/>
-                <w:iCs/>
                 <w:color w:val="000000"/>
                 <w:sz w:val="24"/>
                 <w:szCs w:val="24"/>
+                <w:lang w:val="en-US"/>
               </w:rPr>
               <w:t>Alpha Ratio</w:t>
             </w:r>
@@ -1469,6 +1422,7 @@
                 <w:color w:val="000000"/>
                 <w:sz w:val="24"/>
                 <w:szCs w:val="24"/>
+                <w:lang w:val="en-US"/>
               </w:rPr>
               <w:t>1.0</w:t>
             </w:r>
@@ -1505,6 +1459,7 @@
                 <w:color w:val="000000"/>
                 <w:sz w:val="24"/>
                 <w:szCs w:val="24"/>
+                <w:lang w:val="en-US"/>
               </w:rPr>
               <w:t>2.3</w:t>
             </w:r>
@@ -1541,6 +1496,7 @@
                 <w:color w:val="000000"/>
                 <w:sz w:val="24"/>
                 <w:szCs w:val="24"/>
+                <w:lang w:val="en-US"/>
               </w:rPr>
               <w:t>1.1</w:t>
             </w:r>
@@ -1577,6 +1533,7 @@
                 <w:color w:val="000000"/>
                 <w:sz w:val="24"/>
                 <w:szCs w:val="24"/>
+                <w:lang w:val="en-US"/>
               </w:rPr>
               <w:t>2.3</w:t>
             </w:r>
@@ -1605,8 +1562,6 @@
               <w:spacing w:after="0" w:line="240" w:lineRule="auto"/>
               <w:rPr>
                 <w:rFonts w:eastAsia="Times New Roman" w:cs="Calibri"/>
-                <w:i/>
-                <w:iCs/>
                 <w:color w:val="000000"/>
                 <w:sz w:val="24"/>
                 <w:szCs w:val="24"/>
@@ -1616,11 +1571,10 @@
             <w:r>
               <w:rPr>
                 <w:rFonts w:cs="Calibri"/>
-                <w:i/>
-                <w:iCs/>
                 <w:color w:val="000000"/>
                 <w:sz w:val="24"/>
                 <w:szCs w:val="24"/>
+                <w:lang w:val="en-US"/>
               </w:rPr>
               <w:t>HNR</w:t>
             </w:r>
@@ -1657,6 +1611,7 @@
                 <w:color w:val="000000"/>
                 <w:sz w:val="24"/>
                 <w:szCs w:val="24"/>
+                <w:lang w:val="en-US"/>
               </w:rPr>
               <w:t>12.8</w:t>
             </w:r>
@@ -1693,6 +1648,7 @@
                 <w:color w:val="000000"/>
                 <w:sz w:val="24"/>
                 <w:szCs w:val="24"/>
+                <w:lang w:val="en-US"/>
               </w:rPr>
               <w:t>21.3</w:t>
             </w:r>
@@ -1729,6 +1685,7 @@
                 <w:color w:val="000000"/>
                 <w:sz w:val="24"/>
                 <w:szCs w:val="24"/>
+                <w:lang w:val="en-US"/>
               </w:rPr>
               <w:t>7.3</w:t>
             </w:r>
@@ -1765,6 +1722,7 @@
                 <w:color w:val="000000"/>
                 <w:sz w:val="24"/>
                 <w:szCs w:val="24"/>
+                <w:lang w:val="en-US"/>
               </w:rPr>
               <w:t>19</w:t>
             </w:r>
@@ -1793,27 +1751,22 @@
               <w:spacing w:after="0" w:line="240" w:lineRule="auto"/>
               <w:rPr>
                 <w:rFonts w:eastAsia="Times New Roman" w:cs="Calibri"/>
-                <w:i/>
-                <w:iCs/>
                 <w:color w:val="000000"/>
                 <w:sz w:val="24"/>
                 <w:szCs w:val="24"/>
                 <w:lang w:val="en-US" w:eastAsia="de-DE"/>
               </w:rPr>
             </w:pPr>
-            <w:proofErr w:type="spellStart"/>
             <w:r>
               <w:rPr>
                 <w:rFonts w:cs="Calibri"/>
-                <w:i/>
-                <w:iCs/>
                 <w:color w:val="000000"/>
                 <w:sz w:val="24"/>
                 <w:szCs w:val="24"/>
+                <w:lang w:val="en-US"/>
               </w:rPr>
               <w:t>Jitter</w:t>
             </w:r>
-            <w:proofErr w:type="spellEnd"/>
           </w:p>
         </w:tc>
         <w:tc>
@@ -1847,6 +1800,7 @@
                 <w:color w:val="000000"/>
                 <w:sz w:val="24"/>
                 <w:szCs w:val="24"/>
+                <w:lang w:val="en-US"/>
               </w:rPr>
               <w:t>0.004</w:t>
             </w:r>
@@ -1883,6 +1837,7 @@
                 <w:color w:val="000000"/>
                 <w:sz w:val="24"/>
                 <w:szCs w:val="24"/>
+                <w:lang w:val="en-US"/>
               </w:rPr>
               <w:t>0.004</w:t>
             </w:r>
@@ -1919,6 +1874,7 @@
                 <w:color w:val="000000"/>
                 <w:sz w:val="24"/>
                 <w:szCs w:val="24"/>
+                <w:lang w:val="en-US"/>
               </w:rPr>
               <w:t>0.011</w:t>
             </w:r>
@@ -1955,6 +1911,7 @@
                 <w:color w:val="000000"/>
                 <w:sz w:val="24"/>
                 <w:szCs w:val="24"/>
+                <w:lang w:val="en-US"/>
               </w:rPr>
               <w:t>0.004</w:t>
             </w:r>
@@ -1982,27 +1939,22 @@
               <w:spacing w:after="0" w:line="240" w:lineRule="auto"/>
               <w:rPr>
                 <w:rFonts w:eastAsia="Times New Roman" w:cs="Calibri"/>
-                <w:i/>
-                <w:iCs/>
                 <w:color w:val="000000"/>
                 <w:sz w:val="24"/>
                 <w:szCs w:val="24"/>
                 <w:lang w:val="en-US" w:eastAsia="de-DE"/>
               </w:rPr>
             </w:pPr>
-            <w:proofErr w:type="spellStart"/>
             <w:r>
               <w:rPr>
                 <w:rFonts w:cs="Calibri"/>
-                <w:i/>
-                <w:iCs/>
                 <w:color w:val="000000"/>
                 <w:sz w:val="24"/>
                 <w:szCs w:val="24"/>
+                <w:lang w:val="en-US"/>
               </w:rPr>
               <w:t>Shimmer</w:t>
             </w:r>
-            <w:proofErr w:type="spellEnd"/>
           </w:p>
         </w:tc>
         <w:tc>
@@ -2035,6 +1987,7 @@
                 <w:color w:val="000000"/>
                 <w:sz w:val="24"/>
                 <w:szCs w:val="24"/>
+                <w:lang w:val="en-US"/>
               </w:rPr>
               <w:t>0.035</w:t>
             </w:r>
@@ -2070,6 +2023,7 @@
                 <w:color w:val="000000"/>
                 <w:sz w:val="24"/>
                 <w:szCs w:val="24"/>
+                <w:lang w:val="en-US"/>
               </w:rPr>
               <w:t>0.013</w:t>
             </w:r>
@@ -2105,6 +2059,7 @@
                 <w:color w:val="000000"/>
                 <w:sz w:val="24"/>
                 <w:szCs w:val="24"/>
+                <w:lang w:val="en-US"/>
               </w:rPr>
               <w:t>0.063</w:t>
             </w:r>
@@ -2140,6 +2095,7 @@
                 <w:color w:val="000000"/>
                 <w:sz w:val="24"/>
                 <w:szCs w:val="24"/>
+                <w:lang w:val="en-US"/>
               </w:rPr>
               <w:t>0.013</w:t>
             </w:r>
@@ -2168,8 +2124,6 @@
               <w:spacing w:after="0" w:line="240" w:lineRule="auto"/>
               <w:rPr>
                 <w:rFonts w:eastAsia="Times New Roman" w:cs="Calibri"/>
-                <w:i/>
-                <w:iCs/>
                 <w:color w:val="000000"/>
                 <w:sz w:val="24"/>
                 <w:szCs w:val="24"/>
@@ -2179,11 +2133,10 @@
             <w:r>
               <w:rPr>
                 <w:rFonts w:cs="Calibri"/>
-                <w:i/>
-                <w:iCs/>
                 <w:color w:val="000000"/>
                 <w:sz w:val="24"/>
                 <w:szCs w:val="24"/>
+                <w:lang w:val="en-US"/>
               </w:rPr>
               <w:t>Duration</w:t>
             </w:r>
@@ -2220,6 +2173,7 @@
                 <w:color w:val="000000"/>
                 <w:sz w:val="24"/>
                 <w:szCs w:val="24"/>
+                <w:lang w:val="en-US"/>
               </w:rPr>
               <w:t>885</w:t>
             </w:r>
@@ -2256,6 +2210,7 @@
                 <w:color w:val="000000"/>
                 <w:sz w:val="24"/>
                 <w:szCs w:val="24"/>
+                <w:lang w:val="en-US"/>
               </w:rPr>
               <w:t>760</w:t>
             </w:r>
@@ -2292,6 +2247,7 @@
                 <w:color w:val="000000"/>
                 <w:sz w:val="24"/>
                 <w:szCs w:val="24"/>
+                <w:lang w:val="en-US"/>
               </w:rPr>
               <w:t>731</w:t>
             </w:r>
@@ -2328,6 +2284,7 @@
                 <w:color w:val="000000"/>
                 <w:sz w:val="24"/>
                 <w:szCs w:val="24"/>
+                <w:lang w:val="en-US"/>
               </w:rPr>
               <w:t>854</w:t>
             </w:r>
@@ -2369,8 +2326,77 @@
           <w:szCs w:val="24"/>
           <w:lang w:val="en-US"/>
         </w:rPr>
-        <w:t xml:space="preserve">Note. All </w:t>
+        <w:t xml:space="preserve">Note. All acoustic parameters were adapted from </w:t>
       </w:r>
+      <w:sdt>
+        <w:sdtPr>
+          <w:rPr>
+            <w:i/>
+            <w:iCs/>
+            <w:sz w:val="24"/>
+            <w:szCs w:val="24"/>
+            <w:lang w:val="en-US"/>
+          </w:rPr>
+          <w:alias w:val="To edit, see citavi.com/edit"/>
+          <w:tag w:val="CitaviPlaceholder#b85afa92-1c86-4217-ad2b-1d7e69e5a6b2"/>
+          <w:id w:val="1352525689"/>
+          <w:placeholder>
+            <w:docPart w:val="DefaultPlaceholder_-1854013440"/>
+          </w:placeholder>
+        </w:sdtPr>
+        <w:sdtContent>
+          <w:r>
+            <w:rPr>
+              <w:i/>
+              <w:iCs/>
+              <w:sz w:val="24"/>
+              <w:szCs w:val="24"/>
+              <w:lang w:val="en-US"/>
+            </w:rPr>
+            <w:fldChar w:fldCharType="begin"/>
+          </w:r>
+          <w:r>
+            <w:rPr>
+              <w:i/>
+              <w:iCs/>
+              <w:sz w:val="24"/>
+              <w:szCs w:val="24"/>
+              <w:lang w:val="en-US"/>
+            </w:rPr>
+            <w:instrText>ADDIN CitaviPlaceholder{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}</w:instrText>
+          </w:r>
+          <w:r>
+            <w:rPr>
+              <w:i/>
+              <w:iCs/>
+              <w:sz w:val="24"/>
+              <w:szCs w:val="24"/>
+              <w:lang w:val="en-US"/>
+            </w:rPr>
+            <w:fldChar w:fldCharType="separate"/>
+          </w:r>
+          <w:r>
+            <w:rPr>
+              <w:i/>
+              <w:iCs/>
+              <w:sz w:val="24"/>
+              <w:szCs w:val="24"/>
+              <w:lang w:val="en-US"/>
+            </w:rPr>
+            <w:t>McAleer et al.</w:t>
+          </w:r>
+          <w:r>
+            <w:rPr>
+              <w:i/>
+              <w:iCs/>
+              <w:sz w:val="24"/>
+              <w:szCs w:val="24"/>
+              <w:lang w:val="en-US"/>
+            </w:rPr>
+            <w:fldChar w:fldCharType="end"/>
+          </w:r>
+        </w:sdtContent>
+      </w:sdt>
       <w:r>
         <w:rPr>
           <w:i/>
@@ -2379,8 +2405,77 @@
           <w:szCs w:val="24"/>
           <w:lang w:val="en-US"/>
         </w:rPr>
-        <w:t>acoustic</w:t>
+        <w:t xml:space="preserve"> </w:t>
       </w:r>
+      <w:sdt>
+        <w:sdtPr>
+          <w:rPr>
+            <w:i/>
+            <w:iCs/>
+            <w:sz w:val="24"/>
+            <w:szCs w:val="24"/>
+            <w:lang w:val="en-US"/>
+          </w:rPr>
+          <w:alias w:val="To edit, see citavi.com/edit"/>
+          <w:tag w:val="CitaviPlaceholder#5f6ec877-3bef-46d2-968c-f0e6e0b97a89"/>
+          <w:id w:val="771741909"/>
+          <w:placeholder>
+            <w:docPart w:val="DefaultPlaceholder_-1854013440"/>
+          </w:placeholder>
+        </w:sdtPr>
+        <w:sdtContent>
+          <w:r>
+            <w:rPr>
+              <w:i/>
+              <w:iCs/>
+              <w:sz w:val="24"/>
+              <w:szCs w:val="24"/>
+              <w:lang w:val="en-US"/>
+            </w:rPr>
+            <w:fldChar w:fldCharType="begin"/>
+          </w:r>
+          <w:r>
+            <w:rPr>
+              <w:i/>
+              <w:iCs/>
+              <w:sz w:val="24"/>
+              <w:szCs w:val="24"/>
+              <w:lang w:val="en-US"/>
+            </w:rPr>
+            <w:instrText>ADDIN CitaviPlaceholder{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}</w:instrText>
+          </w:r>
+          <w:r>
+            <w:rPr>
+              <w:i/>
+              <w:iCs/>
+              <w:sz w:val="24"/>
+              <w:szCs w:val="24"/>
+              <w:lang w:val="en-US"/>
+            </w:rPr>
+            <w:fldChar w:fldCharType="separate"/>
+          </w:r>
+          <w:r>
+            <w:rPr>
+              <w:i/>
+              <w:iCs/>
+              <w:sz w:val="24"/>
+              <w:szCs w:val="24"/>
+              <w:lang w:val="en-US"/>
+            </w:rPr>
+            <w:t>(2014)</w:t>
+          </w:r>
+          <w:r>
+            <w:rPr>
+              <w:i/>
+              <w:iCs/>
+              <w:sz w:val="24"/>
+              <w:szCs w:val="24"/>
+              <w:lang w:val="en-US"/>
+            </w:rPr>
+            <w:fldChar w:fldCharType="end"/>
+          </w:r>
+        </w:sdtContent>
+      </w:sdt>
       <w:r>
         <w:rPr>
           <w:i/>
@@ -2389,7 +2484,7 @@
           <w:szCs w:val="24"/>
           <w:lang w:val="en-US"/>
         </w:rPr>
-        <w:t xml:space="preserve"> parameters were adapted from McAleer et al. (2014) and extracted using </w:t>
+        <w:t xml:space="preserve"> and extracted using </w:t>
       </w:r>
       <w:proofErr w:type="spellStart"/>
       <w:r>
@@ -2411,7 +2506,7 @@
           <w:szCs w:val="24"/>
           <w:lang w:val="en-US"/>
         </w:rPr>
-        <w:t xml:space="preserve"> software (Boersma, 2018). For F0 extraction, pitch ranges were set to 170 - 600 Hz for female and 100 - 370 Hz for male stimuli. F0 Intonation = F0max – F0min; F0 Glide = F0End – F0Start; Alpha ratio (a measure of the spectral slope) = ratio of mean energy within low (0–1 kHz) and high frequencies (1–5 kHz), computed from the long-term average spectrum; HNR (harmonics-to-noise ratio) was extracted with the cross-correlation method (mean value; time step = 0.01 s; min pitch = 75 Hz; silence threshold = 0.1,  periods per window = 1.0), Jitter as a measure of local F0 variation (shortest period = 0.0001 s; longest period = 0.02 s; max. period factor = 1.3); Shimmer as a measure of local amplitude variation (shortest period = 0.0001 s; longest period = 0.02 s; max. period factor = 1.3; max. amplitude factor = 1.6)</w:t>
+        <w:t xml:space="preserve"> software</w:t>
       </w:r>
       <w:r>
         <w:rPr>
@@ -2421,7 +2516,86 @@
           <w:szCs w:val="24"/>
           <w:lang w:val="en-US"/>
         </w:rPr>
-        <w:t xml:space="preserve">; Duration in </w:t>
+        <w:t xml:space="preserve"> </w:t>
+      </w:r>
+      <w:sdt>
+        <w:sdtPr>
+          <w:rPr>
+            <w:i/>
+            <w:iCs/>
+            <w:sz w:val="24"/>
+            <w:szCs w:val="24"/>
+            <w:lang w:val="en-US"/>
+          </w:rPr>
+          <w:alias w:val="To edit, see citavi.com/edit"/>
+          <w:tag w:val="CitaviPlaceholder#115dd74b-b7b0-417d-8c9a-199ab11a3e0b"/>
+          <w:id w:val="597604145"/>
+          <w:placeholder>
+            <w:docPart w:val="DefaultPlaceholder_-1854013440"/>
+          </w:placeholder>
+        </w:sdtPr>
+        <w:sdtContent>
+          <w:r>
+            <w:rPr>
+              <w:i/>
+              <w:iCs/>
+              <w:sz w:val="24"/>
+              <w:szCs w:val="24"/>
+              <w:lang w:val="en-US"/>
+            </w:rPr>
+            <w:fldChar w:fldCharType="begin"/>
+          </w:r>
+          <w:r>
+            <w:rPr>
+              <w:i/>
+              <w:iCs/>
+              <w:sz w:val="24"/>
+              <w:szCs w:val="24"/>
+              <w:lang w:val="en-US"/>
+            </w:rPr>
+            <w:instrText>ADDIN CitaviPlaceholder{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}</w:instrText>
+          </w:r>
+          <w:r>
+            <w:rPr>
+              <w:i/>
+              <w:iCs/>
+              <w:sz w:val="24"/>
+              <w:szCs w:val="24"/>
+              <w:lang w:val="en-US"/>
+            </w:rPr>
+            <w:fldChar w:fldCharType="separate"/>
+          </w:r>
+          <w:r>
+            <w:rPr>
+              <w:i/>
+              <w:iCs/>
+              <w:sz w:val="24"/>
+              <w:szCs w:val="24"/>
+              <w:lang w:val="en-US"/>
+            </w:rPr>
+            <w:t>(Boersma, 2018)</w:t>
+          </w:r>
+          <w:r>
+            <w:rPr>
+              <w:i/>
+              <w:iCs/>
+              <w:sz w:val="24"/>
+              <w:szCs w:val="24"/>
+              <w:lang w:val="en-US"/>
+            </w:rPr>
+            <w:fldChar w:fldCharType="end"/>
+          </w:r>
+        </w:sdtContent>
+      </w:sdt>
+      <w:r>
+        <w:rPr>
+          <w:i/>
+          <w:iCs/>
+          <w:sz w:val="24"/>
+          <w:szCs w:val="24"/>
+          <w:lang w:val="en-US"/>
+        </w:rPr>
+        <w:t xml:space="preserve">. For F0 extraction, pitch ranges were set to 170 - 600 Hz for female and 100 - 370 Hz for male stimuli. F0 Intonation = F0max – F0min; F0 Glide = F0End – F0Start; Alpha ratio (a measure of the spectral slope) = ratio of mean energy within low (0–1 kHz) and high frequencies (1–5 kHz), computed from the long-term average spectrum; HNR (harmonics-to-noise ratio) was extracted with the cross-correlation method (mean value; time step = 0.01 s; min pitch = 75 Hz; silence threshold = 0.1,  periods per window = 1.0), Jitter as a measure of local F0 variation (shortest period = 0.0001 s; longest period = 0.02 s; max. period factor = 1.3); Shimmer as a measure of local amplitude variation (shortest period = 0.0001 s; longest period = 0.02 s; max. period factor = 1.3; max. amplitude factor = 1.6); Duration in </w:t>
       </w:r>
       <w:proofErr w:type="spellStart"/>
       <w:r>
@@ -2487,20 +2661,7 @@
           <w:lang w:val="en-US"/>
         </w:rPr>
         <w:lastRenderedPageBreak/>
-        <w:t>Table S</w:t>
-      </w:r>
-      <w:r>
-        <w:rPr>
-          <w:b/>
-          <w:bCs/>
-          <w:i w:val="0"/>
-          <w:iCs w:val="0"/>
-          <w:color w:val="auto"/>
-          <w:sz w:val="24"/>
-          <w:szCs w:val="24"/>
-          <w:lang w:val="en-US"/>
-        </w:rPr>
-        <w:t>2</w:t>
+        <w:t>Table S2</w:t>
       </w:r>
     </w:p>
     <w:p>
@@ -2517,15 +2678,7 @@
           <w:iCs/>
           <w:lang w:val="en-US"/>
         </w:rPr>
-        <w:t xml:space="preserve">Summary of the acoustic characteristics of </w:t>
-      </w:r>
-      <w:r>
-        <w:rPr>
-          <w:i/>
-          <w:iCs/>
-          <w:lang w:val="en-US"/>
-        </w:rPr>
-        <w:t>target stimuli – part 1</w:t>
+        <w:t>Summary of the acoustic characteristics of target stimuli – part 1</w:t>
       </w:r>
     </w:p>
     <w:tbl>
@@ -2534,7 +2687,7 @@
         <w:tblLook w:val="04A0" w:firstRow="1" w:lastRow="0" w:firstColumn="1" w:lastColumn="0" w:noHBand="0" w:noVBand="1"/>
       </w:tblPr>
       <w:tblGrid>
-        <w:gridCol w:w="820"/>
+        <w:gridCol w:w="1170"/>
         <w:gridCol w:w="580"/>
         <w:gridCol w:w="920"/>
         <w:gridCol w:w="840"/>
@@ -2576,7 +2729,15 @@
                 <w:color w:val="000000"/>
                 <w:lang w:val="en-US"/>
               </w:rPr>
-              <w:t>SpSex</w:t>
+              <w:t>Sp</w:t>
+            </w:r>
+            <w:r>
+              <w:rPr>
+                <w:rFonts w:eastAsia="Times New Roman" w:cs="Calibri"/>
+                <w:color w:val="000000"/>
+                <w:lang w:val="en-US"/>
+              </w:rPr>
+              <w:t>Gender</w:t>
             </w:r>
             <w:proofErr w:type="spellEnd"/>
           </w:p>
@@ -5713,7 +5874,7 @@
           <w:iCs/>
           <w:lang w:val="en-US"/>
         </w:rPr>
-        <w:t xml:space="preserve">Note. All acoustic parameters were extracted </w:t>
+        <w:t>Note. All acoustic parameters were extracted like the ones reported in Table S1.</w:t>
       </w:r>
       <w:r>
         <w:rPr>
@@ -5721,7 +5882,43 @@
           <w:iCs/>
           <w:lang w:val="en-US"/>
         </w:rPr>
-        <w:t>like</w:t>
+        <w:t xml:space="preserve"> </w:t>
+      </w:r>
+      <w:proofErr w:type="spellStart"/>
+      <w:r>
+        <w:rPr>
+          <w:i/>
+          <w:iCs/>
+          <w:lang w:val="en-US"/>
+        </w:rPr>
+        <w:t>SpGender</w:t>
+      </w:r>
+      <w:proofErr w:type="spellEnd"/>
+      <w:r>
+        <w:rPr>
+          <w:i/>
+          <w:iCs/>
+          <w:lang w:val="en-US"/>
+        </w:rPr>
+        <w:t xml:space="preserve"> = speaker gender (f = female, m = male), </w:t>
+      </w:r>
+      <w:proofErr w:type="spellStart"/>
+      <w:r>
+        <w:rPr>
+          <w:i/>
+          <w:iCs/>
+          <w:lang w:val="en-US"/>
+        </w:rPr>
+        <w:t>tML</w:t>
+      </w:r>
+      <w:proofErr w:type="spellEnd"/>
+      <w:r>
+        <w:rPr>
+          <w:i/>
+          <w:iCs/>
+          <w:lang w:val="en-US"/>
+        </w:rPr>
+        <w:t xml:space="preserve"> = target morph level, corresponding to the % of anger in the voice. </w:t>
       </w:r>
       <w:r>
         <w:rPr>
@@ -5729,7 +5926,7 @@
           <w:iCs/>
           <w:lang w:val="en-US"/>
         </w:rPr>
-        <w:t xml:space="preserve"> the ones reported in Table S1.  </w:t>
+        <w:t xml:space="preserve">  </w:t>
       </w:r>
     </w:p>
     <w:p>
@@ -5757,20 +5954,7 @@
           <w:szCs w:val="24"/>
           <w:lang w:val="en-US"/>
         </w:rPr>
-        <w:t>Table S</w:t>
-      </w:r>
-      <w:r>
-        <w:rPr>
-          <w:b/>
-          <w:bCs/>
-          <w:i w:val="0"/>
-          <w:iCs w:val="0"/>
-          <w:color w:val="auto"/>
-          <w:sz w:val="24"/>
-          <w:szCs w:val="24"/>
-          <w:lang w:val="en-US"/>
-        </w:rPr>
-        <w:t>3</w:t>
+        <w:t>Table S3</w:t>
       </w:r>
     </w:p>
     <w:p>
@@ -5787,15 +5971,7 @@
           <w:iCs/>
           <w:lang w:val="en-US"/>
         </w:rPr>
-        <w:t xml:space="preserve">Summary of the acoustic characteristics of target stimuli – </w:t>
-      </w:r>
-      <w:r>
-        <w:rPr>
-          <w:i/>
-          <w:iCs/>
-          <w:lang w:val="en-US"/>
-        </w:rPr>
-        <w:t>part 2</w:t>
+        <w:t>Summary of the acoustic characteristics of target stimuli – part 2</w:t>
       </w:r>
     </w:p>
     <w:tbl>
@@ -5804,7 +5980,7 @@
         <w:tblLook w:val="04A0" w:firstRow="1" w:lastRow="0" w:firstColumn="1" w:lastColumn="0" w:noHBand="0" w:noVBand="1"/>
       </w:tblPr>
       <w:tblGrid>
-        <w:gridCol w:w="820"/>
+        <w:gridCol w:w="1170"/>
         <w:gridCol w:w="580"/>
         <w:gridCol w:w="920"/>
         <w:gridCol w:w="840"/>
@@ -5847,7 +6023,15 @@
                 <w:color w:val="000000"/>
                 <w:lang w:val="en-US"/>
               </w:rPr>
-              <w:t>SpSex</w:t>
+              <w:t>Sp</w:t>
+            </w:r>
+            <w:r>
+              <w:rPr>
+                <w:rFonts w:eastAsia="Times New Roman" w:cs="Calibri"/>
+                <w:color w:val="000000"/>
+                <w:lang w:val="en-US"/>
+              </w:rPr>
+              <w:t>Gender</w:t>
             </w:r>
             <w:proofErr w:type="spellEnd"/>
           </w:p>
@@ -9498,7 +9682,43 @@
           <w:iCs/>
           <w:lang w:val="en-US"/>
         </w:rPr>
-        <w:t xml:space="preserve">Note. All acoustic parameters </w:t>
+        <w:t xml:space="preserve">Note. All acoustic parameters were extracted like the ones reported in Table S1. </w:t>
+      </w:r>
+      <w:proofErr w:type="spellStart"/>
+      <w:r>
+        <w:rPr>
+          <w:i/>
+          <w:iCs/>
+          <w:lang w:val="en-US"/>
+        </w:rPr>
+        <w:t>SpGender</w:t>
+      </w:r>
+      <w:proofErr w:type="spellEnd"/>
+      <w:r>
+        <w:rPr>
+          <w:i/>
+          <w:iCs/>
+          <w:lang w:val="en-US"/>
+        </w:rPr>
+        <w:t xml:space="preserve"> = speaker gender (f = female, m = male), </w:t>
+      </w:r>
+      <w:proofErr w:type="spellStart"/>
+      <w:r>
+        <w:rPr>
+          <w:i/>
+          <w:iCs/>
+          <w:lang w:val="en-US"/>
+        </w:rPr>
+        <w:t>tML</w:t>
+      </w:r>
+      <w:proofErr w:type="spellEnd"/>
+      <w:r>
+        <w:rPr>
+          <w:i/>
+          <w:iCs/>
+          <w:lang w:val="en-US"/>
+        </w:rPr>
+        <w:t xml:space="preserve"> = target morph level, corresponding to the % of anger in the voice. </w:t>
       </w:r>
       <w:r>
         <w:rPr>
@@ -9506,8 +9726,19 @@
           <w:iCs/>
           <w:lang w:val="en-US"/>
         </w:rPr>
-        <w:t xml:space="preserve">were extracted like the ones reported in Table S1. </w:t>
+        <w:t xml:space="preserve">  </w:t>
       </w:r>
+    </w:p>
+    <w:p>
+      <w:pPr>
+        <w:suppressAutoHyphens w:val="0"/>
+        <w:spacing w:line="278" w:lineRule="auto"/>
+        <w:rPr>
+          <w:i/>
+          <w:iCs/>
+          <w:lang w:val="en-US"/>
+        </w:rPr>
+      </w:pPr>
     </w:p>
     <w:p>
       <w:pPr>
@@ -9580,17 +9811,7 @@
           <w:iCs/>
           <w:lang w:val="en-US"/>
         </w:rPr>
-        <w:t xml:space="preserve">Full Parameter List </w:t>
-      </w:r>
-      <w:r>
-        <w:rPr>
-          <w:rFonts w:cs="Times New Roman"/>
-          <w:bCs/>
-          <w:i/>
-          <w:iCs/>
-          <w:lang w:val="en-US"/>
-        </w:rPr>
-        <w:t>of Multilevel Logistic Regression for Experiment 3</w:t>
+        <w:t>Full Parameter List of Multilevel Logistic Regression for Experiment 3</w:t>
       </w:r>
     </w:p>
     <w:tbl>
@@ -13132,47 +13353,7 @@
           <w:iCs/>
           <w:lang w:val="en-US"/>
         </w:rPr>
-        <w:t xml:space="preserve">Additional </w:t>
-      </w:r>
-      <w:r>
-        <w:rPr>
-          <w:rFonts w:cs="Times New Roman"/>
-          <w:bCs/>
-          <w:i/>
-          <w:iCs/>
-          <w:lang w:val="en-US"/>
-        </w:rPr>
-        <w:t>Multilevel Logistic Regression</w:t>
-      </w:r>
-      <w:r>
-        <w:rPr>
-          <w:rFonts w:cs="Times New Roman"/>
-          <w:bCs/>
-          <w:i/>
-          <w:iCs/>
-          <w:lang w:val="en-US"/>
-        </w:rPr>
-        <w:t>s</w:t>
-      </w:r>
-      <w:r>
-        <w:rPr>
-          <w:rFonts w:cs="Times New Roman"/>
-          <w:bCs/>
-          <w:i/>
-          <w:iCs/>
-          <w:lang w:val="en-US"/>
-        </w:rPr>
-        <w:t xml:space="preserve"> for Experiment 3</w:t>
-      </w:r>
-      <w:r>
-        <w:rPr>
-          <w:rFonts w:cs="Times New Roman"/>
-          <w:bCs/>
-          <w:i/>
-          <w:iCs/>
-          <w:lang w:val="en-US"/>
-        </w:rPr>
-        <w:t>, separate for males and females</w:t>
+        <w:t>Additional Multilevel Logistic Regressions for Experiment 3, separate for males and females</w:t>
       </w:r>
     </w:p>
     <w:tbl>
@@ -22149,6 +22330,210 @@
         <w:rPr>
           <w:i/>
           <w:iCs/>
+          <w:lang w:val="en-US"/>
+        </w:rPr>
+      </w:pPr>
+    </w:p>
+    <w:p>
+      <w:pPr>
+        <w:pStyle w:val="CitaviBibliographyEntry"/>
+        <w:rPr>
+          <w:lang w:val="en-US"/>
+        </w:rPr>
+      </w:pPr>
+    </w:p>
+    <w:p>
+      <w:pPr>
+        <w:rPr>
+          <w:lang w:val="en-US"/>
+        </w:rPr>
+      </w:pPr>
+    </w:p>
+    <w:sdt>
+      <w:sdtPr>
+        <w:rPr>
+          <w:lang w:val="en-US"/>
+        </w:rPr>
+        <w:tag w:val="CitaviBibliography"/>
+        <w:id w:val="-1511363744"/>
+        <w:placeholder>
+          <w:docPart w:val="DefaultPlaceholder_-1854013440"/>
+        </w:placeholder>
+      </w:sdtPr>
+      <w:sdtEndPr>
+        <w:rPr>
+          <w:rFonts w:asciiTheme="minorHAnsi" w:eastAsiaTheme="minorHAnsi" w:hAnsiTheme="minorHAnsi" w:cstheme="minorBidi"/>
+          <w:color w:val="auto"/>
+          <w:sz w:val="22"/>
+          <w:szCs w:val="22"/>
+        </w:rPr>
+      </w:sdtEndPr>
+      <w:sdtContent>
+        <w:p>
+          <w:pPr>
+            <w:pStyle w:val="CitaviBibliographyHeading"/>
+            <w:rPr>
+              <w:lang w:val="en-US"/>
+            </w:rPr>
+          </w:pPr>
+          <w:r>
+            <w:rPr>
+              <w:lang w:val="en-US"/>
+            </w:rPr>
+            <w:fldChar w:fldCharType="begin"/>
+          </w:r>
+          <w:r>
+            <w:rPr>
+              <w:lang w:val="en-US"/>
+            </w:rPr>
+            <w:instrText>ADDIN CitaviBibliography</w:instrText>
+          </w:r>
+          <w:r>
+            <w:rPr>
+              <w:lang w:val="en-US"/>
+            </w:rPr>
+            <w:fldChar w:fldCharType="separate"/>
+          </w:r>
+          <w:r>
+            <w:rPr>
+              <w:lang w:val="en-US"/>
+            </w:rPr>
+            <w:t>References</w:t>
+          </w:r>
+        </w:p>
+        <w:p>
+          <w:pPr>
+            <w:pStyle w:val="CitaviBibliographyEntry"/>
+            <w:rPr>
+              <w:lang w:val="en-US"/>
+            </w:rPr>
+          </w:pPr>
+          <w:bookmarkStart w:id="1" w:name="_CTVL0018bcf5d59f8824881bbcb07603366cee6"/>
+          <w:r>
+            <w:rPr>
+              <w:lang w:val="en-US"/>
+            </w:rPr>
+            <w:t xml:space="preserve">Boersma, P. (2018). </w:t>
+          </w:r>
+          <w:proofErr w:type="spellStart"/>
+          <w:r>
+            <w:rPr>
+              <w:lang w:val="en-US"/>
+            </w:rPr>
+            <w:t>Praat</w:t>
+          </w:r>
+          <w:proofErr w:type="spellEnd"/>
+          <w:r>
+            <w:rPr>
+              <w:lang w:val="en-US"/>
+            </w:rPr>
+            <w:t>: Doing phonetics by computer [Computer program]: Version 6.0.46, retrieved January 2020 from http://www.praat.org/.</w:t>
+          </w:r>
+          <w:bookmarkEnd w:id="1"/>
+          <w:r>
+            <w:rPr>
+              <w:lang w:val="en-US"/>
+            </w:rPr>
+            <w:t xml:space="preserve"> </w:t>
+          </w:r>
+          <w:r>
+            <w:rPr>
+              <w:i/>
+              <w:lang w:val="en-US"/>
+            </w:rPr>
+            <w:t xml:space="preserve">Http://www. </w:t>
+          </w:r>
+          <w:proofErr w:type="spellStart"/>
+          <w:r>
+            <w:rPr>
+              <w:i/>
+              <w:lang w:val="en-US"/>
+            </w:rPr>
+            <w:t>Praat</w:t>
+          </w:r>
+          <w:proofErr w:type="spellEnd"/>
+          <w:r>
+            <w:rPr>
+              <w:i/>
+              <w:lang w:val="en-US"/>
+            </w:rPr>
+            <w:t>. Org</w:t>
+          </w:r>
+          <w:r>
+            <w:rPr>
+              <w:lang w:val="en-US"/>
+            </w:rPr>
+            <w:t>.</w:t>
+          </w:r>
+        </w:p>
+        <w:p>
+          <w:pPr>
+            <w:pStyle w:val="CitaviBibliographyEntry"/>
+            <w:rPr>
+              <w:lang w:val="en-US"/>
+            </w:rPr>
+          </w:pPr>
+          <w:bookmarkStart w:id="2" w:name="_CTVL00144ae98bec96147d3a583986dd3bf9701"/>
+          <w:r>
+            <w:rPr>
+              <w:lang w:val="en-US"/>
+            </w:rPr>
+            <w:t>McAleer, P., Todorov, A., &amp; Belin, P. (2014). How do you say ‘Hello’? Personality impressions from brief novel voices.</w:t>
+          </w:r>
+          <w:bookmarkEnd w:id="2"/>
+          <w:r>
+            <w:rPr>
+              <w:lang w:val="en-US"/>
+            </w:rPr>
+            <w:t xml:space="preserve"> </w:t>
+          </w:r>
+          <w:proofErr w:type="spellStart"/>
+          <w:r>
+            <w:rPr>
+              <w:i/>
+              <w:lang w:val="en-US"/>
+            </w:rPr>
+            <w:t>PLoS</w:t>
+          </w:r>
+          <w:proofErr w:type="spellEnd"/>
+          <w:r>
+            <w:rPr>
+              <w:i/>
+              <w:lang w:val="en-US"/>
+            </w:rPr>
+            <w:t xml:space="preserve"> One</w:t>
+          </w:r>
+          <w:r>
+            <w:rPr>
+              <w:lang w:val="en-US"/>
+            </w:rPr>
+            <w:t xml:space="preserve">, </w:t>
+          </w:r>
+          <w:r>
+            <w:rPr>
+              <w:i/>
+              <w:lang w:val="en-US"/>
+            </w:rPr>
+            <w:t>9</w:t>
+          </w:r>
+          <w:r>
+            <w:rPr>
+              <w:lang w:val="en-US"/>
+            </w:rPr>
+            <w:t>(3), e90779. https://doi.org/10.1371/journal.pone.0090779</w:t>
+          </w:r>
+          <w:r>
+            <w:rPr>
+              <w:lang w:val="en-US"/>
+            </w:rPr>
+            <w:fldChar w:fldCharType="end"/>
+          </w:r>
+        </w:p>
+      </w:sdtContent>
+    </w:sdt>
+    <w:p>
+      <w:pPr>
+        <w:rPr>
           <w:lang w:val="en-US"/>
         </w:rPr>
       </w:pPr>
@@ -22926,7 +23311,6 @@
   <w:style w:type="character" w:default="1" w:styleId="Absatz-Standardschriftart">
     <w:name w:val="Default Paragraph Font"/>
     <w:uiPriority w:val="1"/>
-    <w:semiHidden/>
     <w:unhideWhenUsed/>
   </w:style>
   <w:style w:type="table" w:default="1" w:styleId="NormaleTabelle">
@@ -23318,7 +23702,913 @@
       <w14:ligatures w14:val="none"/>
     </w:rPr>
   </w:style>
+  <w:style w:type="character" w:styleId="Platzhaltertext">
+    <w:name w:val="Placeholder Text"/>
+    <w:basedOn w:val="Absatz-Standardschriftart"/>
+    <w:uiPriority w:val="99"/>
+    <w:semiHidden/>
+    <w:rsid w:val="000D7523"/>
+    <w:rPr>
+      <w:color w:val="666666"/>
+    </w:rPr>
+  </w:style>
+  <w:style w:type="paragraph" w:customStyle="1" w:styleId="CitaviBibliographyEntry">
+    <w:name w:val="Citavi Bibliography Entry"/>
+    <w:basedOn w:val="Standard"/>
+    <w:link w:val="CitaviBibliographyEntryZchn"/>
+    <w:uiPriority w:val="99"/>
+    <w:rsid w:val="000D7523"/>
+    <w:pPr>
+      <w:tabs>
+        <w:tab w:val="left" w:pos="720"/>
+      </w:tabs>
+      <w:spacing w:after="0"/>
+      <w:ind w:left="720" w:hanging="720"/>
+    </w:pPr>
+  </w:style>
+  <w:style w:type="character" w:customStyle="1" w:styleId="CitaviBibliographyEntryZchn">
+    <w:name w:val="Citavi Bibliography Entry Zchn"/>
+    <w:basedOn w:val="Absatz-Standardschriftart"/>
+    <w:link w:val="CitaviBibliographyEntry"/>
+    <w:uiPriority w:val="99"/>
+    <w:rsid w:val="000D7523"/>
+    <w:rPr>
+      <w:kern w:val="0"/>
+      <w:sz w:val="22"/>
+      <w:szCs w:val="22"/>
+      <w:lang w:val="de-DE"/>
+      <w14:ligatures w14:val="none"/>
+    </w:rPr>
+  </w:style>
+  <w:style w:type="paragraph" w:customStyle="1" w:styleId="CitaviBibliographyHeading">
+    <w:name w:val="Citavi Bibliography Heading"/>
+    <w:basedOn w:val="berschrift1"/>
+    <w:link w:val="CitaviBibliographyHeadingZchn"/>
+    <w:uiPriority w:val="99"/>
+    <w:rsid w:val="000D7523"/>
+  </w:style>
+  <w:style w:type="character" w:customStyle="1" w:styleId="CitaviBibliographyHeadingZchn">
+    <w:name w:val="Citavi Bibliography Heading Zchn"/>
+    <w:basedOn w:val="Absatz-Standardschriftart"/>
+    <w:link w:val="CitaviBibliographyHeading"/>
+    <w:uiPriority w:val="99"/>
+    <w:rsid w:val="000D7523"/>
+    <w:rPr>
+      <w:rFonts w:asciiTheme="majorHAnsi" w:eastAsiaTheme="majorEastAsia" w:hAnsiTheme="majorHAnsi" w:cstheme="majorBidi"/>
+      <w:color w:val="0F4761" w:themeColor="accent1" w:themeShade="BF"/>
+      <w:kern w:val="0"/>
+      <w:sz w:val="40"/>
+      <w:szCs w:val="40"/>
+      <w:lang w:val="de-DE"/>
+      <w14:ligatures w14:val="none"/>
+    </w:rPr>
+  </w:style>
+  <w:style w:type="paragraph" w:customStyle="1" w:styleId="CitaviChapterBibliographyHeading">
+    <w:name w:val="Citavi Chapter Bibliography Heading"/>
+    <w:basedOn w:val="berschrift2"/>
+    <w:link w:val="CitaviChapterBibliographyHeadingZchn"/>
+    <w:uiPriority w:val="99"/>
+    <w:rsid w:val="000D7523"/>
+  </w:style>
+  <w:style w:type="character" w:customStyle="1" w:styleId="CitaviChapterBibliographyHeadingZchn">
+    <w:name w:val="Citavi Chapter Bibliography Heading Zchn"/>
+    <w:basedOn w:val="Absatz-Standardschriftart"/>
+    <w:link w:val="CitaviChapterBibliographyHeading"/>
+    <w:uiPriority w:val="99"/>
+    <w:rsid w:val="000D7523"/>
+    <w:rPr>
+      <w:rFonts w:asciiTheme="majorHAnsi" w:eastAsiaTheme="majorEastAsia" w:hAnsiTheme="majorHAnsi" w:cstheme="majorBidi"/>
+      <w:color w:val="0F4761" w:themeColor="accent1" w:themeShade="BF"/>
+      <w:kern w:val="0"/>
+      <w:sz w:val="32"/>
+      <w:szCs w:val="32"/>
+      <w:lang w:val="de-DE"/>
+      <w14:ligatures w14:val="none"/>
+    </w:rPr>
+  </w:style>
+  <w:style w:type="paragraph" w:customStyle="1" w:styleId="CitaviBibliographySubheading1">
+    <w:name w:val="Citavi Bibliography Subheading 1"/>
+    <w:basedOn w:val="berschrift2"/>
+    <w:link w:val="CitaviBibliographySubheading1Zchn"/>
+    <w:uiPriority w:val="99"/>
+    <w:rsid w:val="000D7523"/>
+    <w:pPr>
+      <w:jc w:val="center"/>
+      <w:outlineLvl w:val="9"/>
+    </w:pPr>
+    <w:rPr>
+      <w:rFonts w:ascii="Times New Roman" w:hAnsi="Times New Roman" w:cs="Times New Roman"/>
+      <w:sz w:val="44"/>
+      <w:szCs w:val="44"/>
+      <w:lang w:val="en-US"/>
+    </w:rPr>
+  </w:style>
+  <w:style w:type="character" w:customStyle="1" w:styleId="CitaviBibliographySubheading1Zchn">
+    <w:name w:val="Citavi Bibliography Subheading 1 Zchn"/>
+    <w:basedOn w:val="Absatz-Standardschriftart"/>
+    <w:link w:val="CitaviBibliographySubheading1"/>
+    <w:uiPriority w:val="99"/>
+    <w:rsid w:val="000D7523"/>
+    <w:rPr>
+      <w:rFonts w:ascii="Times New Roman" w:eastAsiaTheme="majorEastAsia" w:hAnsi="Times New Roman" w:cs="Times New Roman"/>
+      <w:color w:val="0F4761" w:themeColor="accent1" w:themeShade="BF"/>
+      <w:kern w:val="0"/>
+      <w:sz w:val="44"/>
+      <w:szCs w:val="44"/>
+      <w14:ligatures w14:val="none"/>
+    </w:rPr>
+  </w:style>
+  <w:style w:type="paragraph" w:customStyle="1" w:styleId="CitaviBibliographySubheading2">
+    <w:name w:val="Citavi Bibliography Subheading 2"/>
+    <w:basedOn w:val="berschrift3"/>
+    <w:link w:val="CitaviBibliographySubheading2Zchn"/>
+    <w:uiPriority w:val="99"/>
+    <w:rsid w:val="000D7523"/>
+    <w:pPr>
+      <w:jc w:val="center"/>
+      <w:outlineLvl w:val="9"/>
+    </w:pPr>
+    <w:rPr>
+      <w:rFonts w:ascii="Times New Roman" w:hAnsi="Times New Roman" w:cs="Times New Roman"/>
+      <w:sz w:val="44"/>
+      <w:szCs w:val="44"/>
+      <w:lang w:val="en-US"/>
+    </w:rPr>
+  </w:style>
+  <w:style w:type="character" w:customStyle="1" w:styleId="CitaviBibliographySubheading2Zchn">
+    <w:name w:val="Citavi Bibliography Subheading 2 Zchn"/>
+    <w:basedOn w:val="Absatz-Standardschriftart"/>
+    <w:link w:val="CitaviBibliographySubheading2"/>
+    <w:uiPriority w:val="99"/>
+    <w:rsid w:val="000D7523"/>
+    <w:rPr>
+      <w:rFonts w:ascii="Times New Roman" w:eastAsiaTheme="majorEastAsia" w:hAnsi="Times New Roman" w:cs="Times New Roman"/>
+      <w:color w:val="0F4761" w:themeColor="accent1" w:themeShade="BF"/>
+      <w:kern w:val="0"/>
+      <w:sz w:val="44"/>
+      <w:szCs w:val="44"/>
+      <w14:ligatures w14:val="none"/>
+    </w:rPr>
+  </w:style>
+  <w:style w:type="paragraph" w:customStyle="1" w:styleId="CitaviBibliographySubheading3">
+    <w:name w:val="Citavi Bibliography Subheading 3"/>
+    <w:basedOn w:val="berschrift4"/>
+    <w:link w:val="CitaviBibliographySubheading3Zchn"/>
+    <w:uiPriority w:val="99"/>
+    <w:rsid w:val="000D7523"/>
+    <w:pPr>
+      <w:jc w:val="center"/>
+      <w:outlineLvl w:val="9"/>
+    </w:pPr>
+    <w:rPr>
+      <w:rFonts w:ascii="Times New Roman" w:hAnsi="Times New Roman" w:cs="Times New Roman"/>
+      <w:sz w:val="44"/>
+      <w:szCs w:val="44"/>
+      <w:lang w:val="en-US"/>
+    </w:rPr>
+  </w:style>
+  <w:style w:type="character" w:customStyle="1" w:styleId="CitaviBibliographySubheading3Zchn">
+    <w:name w:val="Citavi Bibliography Subheading 3 Zchn"/>
+    <w:basedOn w:val="Absatz-Standardschriftart"/>
+    <w:link w:val="CitaviBibliographySubheading3"/>
+    <w:uiPriority w:val="99"/>
+    <w:rsid w:val="000D7523"/>
+    <w:rPr>
+      <w:rFonts w:ascii="Times New Roman" w:eastAsiaTheme="majorEastAsia" w:hAnsi="Times New Roman" w:cs="Times New Roman"/>
+      <w:i/>
+      <w:iCs/>
+      <w:color w:val="0F4761" w:themeColor="accent1" w:themeShade="BF"/>
+      <w:kern w:val="0"/>
+      <w:sz w:val="44"/>
+      <w:szCs w:val="44"/>
+      <w14:ligatures w14:val="none"/>
+    </w:rPr>
+  </w:style>
+  <w:style w:type="paragraph" w:customStyle="1" w:styleId="CitaviBibliographySubheading4">
+    <w:name w:val="Citavi Bibliography Subheading 4"/>
+    <w:basedOn w:val="berschrift5"/>
+    <w:link w:val="CitaviBibliographySubheading4Zchn"/>
+    <w:uiPriority w:val="99"/>
+    <w:rsid w:val="000D7523"/>
+    <w:pPr>
+      <w:jc w:val="center"/>
+      <w:outlineLvl w:val="9"/>
+    </w:pPr>
+    <w:rPr>
+      <w:rFonts w:ascii="Times New Roman" w:hAnsi="Times New Roman" w:cs="Times New Roman"/>
+      <w:sz w:val="44"/>
+      <w:szCs w:val="44"/>
+      <w:lang w:val="en-US"/>
+    </w:rPr>
+  </w:style>
+  <w:style w:type="character" w:customStyle="1" w:styleId="CitaviBibliographySubheading4Zchn">
+    <w:name w:val="Citavi Bibliography Subheading 4 Zchn"/>
+    <w:basedOn w:val="Absatz-Standardschriftart"/>
+    <w:link w:val="CitaviBibliographySubheading4"/>
+    <w:uiPriority w:val="99"/>
+    <w:rsid w:val="000D7523"/>
+    <w:rPr>
+      <w:rFonts w:ascii="Times New Roman" w:eastAsiaTheme="majorEastAsia" w:hAnsi="Times New Roman" w:cs="Times New Roman"/>
+      <w:color w:val="0F4761" w:themeColor="accent1" w:themeShade="BF"/>
+      <w:kern w:val="0"/>
+      <w:sz w:val="44"/>
+      <w:szCs w:val="44"/>
+      <w14:ligatures w14:val="none"/>
+    </w:rPr>
+  </w:style>
+  <w:style w:type="paragraph" w:customStyle="1" w:styleId="CitaviBibliographySubheading5">
+    <w:name w:val="Citavi Bibliography Subheading 5"/>
+    <w:basedOn w:val="berschrift6"/>
+    <w:link w:val="CitaviBibliographySubheading5Zchn"/>
+    <w:uiPriority w:val="99"/>
+    <w:rsid w:val="000D7523"/>
+    <w:pPr>
+      <w:jc w:val="center"/>
+      <w:outlineLvl w:val="9"/>
+    </w:pPr>
+    <w:rPr>
+      <w:rFonts w:ascii="Times New Roman" w:hAnsi="Times New Roman" w:cs="Times New Roman"/>
+      <w:sz w:val="44"/>
+      <w:szCs w:val="44"/>
+      <w:lang w:val="en-US"/>
+    </w:rPr>
+  </w:style>
+  <w:style w:type="character" w:customStyle="1" w:styleId="CitaviBibliographySubheading5Zchn">
+    <w:name w:val="Citavi Bibliography Subheading 5 Zchn"/>
+    <w:basedOn w:val="Absatz-Standardschriftart"/>
+    <w:link w:val="CitaviBibliographySubheading5"/>
+    <w:uiPriority w:val="99"/>
+    <w:rsid w:val="000D7523"/>
+    <w:rPr>
+      <w:rFonts w:ascii="Times New Roman" w:eastAsiaTheme="majorEastAsia" w:hAnsi="Times New Roman" w:cs="Times New Roman"/>
+      <w:i/>
+      <w:iCs/>
+      <w:color w:val="595959" w:themeColor="text1" w:themeTint="A6"/>
+      <w:kern w:val="0"/>
+      <w:sz w:val="44"/>
+      <w:szCs w:val="44"/>
+      <w14:ligatures w14:val="none"/>
+    </w:rPr>
+  </w:style>
+  <w:style w:type="paragraph" w:customStyle="1" w:styleId="CitaviBibliographySubheading6">
+    <w:name w:val="Citavi Bibliography Subheading 6"/>
+    <w:basedOn w:val="berschrift7"/>
+    <w:link w:val="CitaviBibliographySubheading6Zchn"/>
+    <w:uiPriority w:val="99"/>
+    <w:rsid w:val="000D7523"/>
+    <w:pPr>
+      <w:jc w:val="center"/>
+      <w:outlineLvl w:val="9"/>
+    </w:pPr>
+    <w:rPr>
+      <w:rFonts w:ascii="Times New Roman" w:hAnsi="Times New Roman" w:cs="Times New Roman"/>
+      <w:sz w:val="44"/>
+      <w:szCs w:val="44"/>
+      <w:lang w:val="en-US"/>
+    </w:rPr>
+  </w:style>
+  <w:style w:type="character" w:customStyle="1" w:styleId="CitaviBibliographySubheading6Zchn">
+    <w:name w:val="Citavi Bibliography Subheading 6 Zchn"/>
+    <w:basedOn w:val="Absatz-Standardschriftart"/>
+    <w:link w:val="CitaviBibliographySubheading6"/>
+    <w:uiPriority w:val="99"/>
+    <w:rsid w:val="000D7523"/>
+    <w:rPr>
+      <w:rFonts w:ascii="Times New Roman" w:eastAsiaTheme="majorEastAsia" w:hAnsi="Times New Roman" w:cs="Times New Roman"/>
+      <w:color w:val="595959" w:themeColor="text1" w:themeTint="A6"/>
+      <w:kern w:val="0"/>
+      <w:sz w:val="44"/>
+      <w:szCs w:val="44"/>
+      <w14:ligatures w14:val="none"/>
+    </w:rPr>
+  </w:style>
+  <w:style w:type="paragraph" w:customStyle="1" w:styleId="CitaviBibliographySubheading7">
+    <w:name w:val="Citavi Bibliography Subheading 7"/>
+    <w:basedOn w:val="berschrift8"/>
+    <w:link w:val="CitaviBibliographySubheading7Zchn"/>
+    <w:uiPriority w:val="99"/>
+    <w:rsid w:val="000D7523"/>
+    <w:pPr>
+      <w:jc w:val="center"/>
+      <w:outlineLvl w:val="9"/>
+    </w:pPr>
+    <w:rPr>
+      <w:rFonts w:ascii="Times New Roman" w:hAnsi="Times New Roman" w:cs="Times New Roman"/>
+      <w:sz w:val="44"/>
+      <w:szCs w:val="44"/>
+      <w:lang w:val="en-US"/>
+    </w:rPr>
+  </w:style>
+  <w:style w:type="character" w:customStyle="1" w:styleId="CitaviBibliographySubheading7Zchn">
+    <w:name w:val="Citavi Bibliography Subheading 7 Zchn"/>
+    <w:basedOn w:val="Absatz-Standardschriftart"/>
+    <w:link w:val="CitaviBibliographySubheading7"/>
+    <w:uiPriority w:val="99"/>
+    <w:rsid w:val="000D7523"/>
+    <w:rPr>
+      <w:rFonts w:ascii="Times New Roman" w:eastAsiaTheme="majorEastAsia" w:hAnsi="Times New Roman" w:cs="Times New Roman"/>
+      <w:i/>
+      <w:iCs/>
+      <w:color w:val="272727" w:themeColor="text1" w:themeTint="D8"/>
+      <w:kern w:val="0"/>
+      <w:sz w:val="44"/>
+      <w:szCs w:val="44"/>
+      <w14:ligatures w14:val="none"/>
+    </w:rPr>
+  </w:style>
+  <w:style w:type="paragraph" w:customStyle="1" w:styleId="CitaviBibliographySubheading8">
+    <w:name w:val="Citavi Bibliography Subheading 8"/>
+    <w:basedOn w:val="berschrift9"/>
+    <w:link w:val="CitaviBibliographySubheading8Zchn"/>
+    <w:uiPriority w:val="99"/>
+    <w:rsid w:val="000D7523"/>
+    <w:pPr>
+      <w:jc w:val="center"/>
+      <w:outlineLvl w:val="9"/>
+    </w:pPr>
+    <w:rPr>
+      <w:rFonts w:ascii="Times New Roman" w:hAnsi="Times New Roman" w:cs="Times New Roman"/>
+      <w:sz w:val="44"/>
+      <w:szCs w:val="44"/>
+      <w:lang w:val="en-US"/>
+    </w:rPr>
+  </w:style>
+  <w:style w:type="character" w:customStyle="1" w:styleId="CitaviBibliographySubheading8Zchn">
+    <w:name w:val="Citavi Bibliography Subheading 8 Zchn"/>
+    <w:basedOn w:val="Absatz-Standardschriftart"/>
+    <w:link w:val="CitaviBibliographySubheading8"/>
+    <w:uiPriority w:val="99"/>
+    <w:rsid w:val="000D7523"/>
+    <w:rPr>
+      <w:rFonts w:ascii="Times New Roman" w:eastAsiaTheme="majorEastAsia" w:hAnsi="Times New Roman" w:cs="Times New Roman"/>
+      <w:color w:val="272727" w:themeColor="text1" w:themeTint="D8"/>
+      <w:kern w:val="0"/>
+      <w:sz w:val="44"/>
+      <w:szCs w:val="44"/>
+      <w14:ligatures w14:val="none"/>
+    </w:rPr>
+  </w:style>
 </w:styles>
+</file>
+
+<file path=word/glossary/document.xml><?xml version="1.0" encoding="utf-8"?>
+<w:glossaryDocument xmlns:wpc="http://schemas.microsoft.com/office/word/2010/wordprocessingCanvas" xmlns:cx="http://schemas.microsoft.com/office/drawing/2014/chartex" xmlns:cx1="http://schemas.microsoft.com/office/drawing/2015/9/8/chartex" xmlns:cx2="http://schemas.microsoft.com/office/drawing/2015/10/21/chartex" xmlns:cx3="http://schemas.microsoft.com/office/drawing/2016/5/9/chartex" xmlns:cx4="http://schemas.microsoft.com/office/drawing/2016/5/10/chartex" xmlns:cx5="http://schemas.microsoft.com/office/drawing/2016/5/11/chartex" xmlns:cx6="http://schemas.microsoft.com/office/drawing/2016/5/12/chartex" xmlns:cx7="http://schemas.microsoft.com/office/drawing/2016/5/13/chartex" xmlns:cx8="http://schemas.microsoft.com/office/drawing/2016/5/14/chartex" xmlns:mc="http://schemas.openxmlformats.org/markup-compatibility/2006" xmlns:aink="http://schemas.microsoft.com/office/drawing/2016/ink" xmlns:am3d="http://schemas.microsoft.com/office/drawing/2017/model3d" xmlns:o="urn:schemas-microsoft-com:office:office" xmlns:oel="http://schemas.microsoft.com/office/2019/extlst" xmlns:r="http://schemas.openxmlformats.org/officeDocument/2006/relationships" xmlns:m="http://schemas.openxmlformats.org/officeDocument/2006/math" xmlns:v="urn:schemas-microsoft-com:vml" xmlns:wp14="http://schemas.microsoft.com/office/word/2010/wordprocessingDrawing" xmlns:wp="http://schemas.openxmlformats.org/drawingml/2006/wordprocessingDrawing" xmlns:w10="urn:schemas-microsoft-com:office:word" xmlns:w="http://schemas.openxmlformats.org/wordprocessingml/2006/main" xmlns:w14="http://schemas.microsoft.com/office/word/2010/wordml" xmlns:w15="http://schemas.microsoft.com/office/word/2012/wordml" xmlns:w16cex="http://schemas.microsoft.com/office/word/2018/wordml/cex" xmlns:w16cid="http://schemas.microsoft.com/office/word/2016/wordml/cid" xmlns:w16="http://schemas.microsoft.com/office/word/2018/wordml" xmlns:w16du="http://schemas.microsoft.com/office/word/2023/wordml/word16du" xmlns:w16sdtdh="http://schemas.microsoft.com/office/word/2020/wordml/sdtdatahash" xmlns:w16sdtfl="http://schemas.microsoft.com/office/word/2024/wordml/sdtformatlock" xmlns:w16se="http://schemas.microsoft.com/office/word/2015/wordml/symex" xmlns:wpg="http://schemas.microsoft.com/office/word/2010/wordprocessingGroup" xmlns:wpi="http://schemas.microsoft.com/office/word/2010/wordprocessingInk" xmlns:wne="http://schemas.microsoft.com/office/word/2006/wordml" xmlns:wps="http://schemas.microsoft.com/office/word/2010/wordprocessingShape" mc:Ignorable="w14 w15 w16se w16cid w16 w16cex w16sdtdh w16sdtfl w16du wp14">
+  <w:docParts>
+    <w:docPart>
+      <w:docPartPr>
+        <w:name w:val="DefaultPlaceholder_-1854013440"/>
+        <w:category>
+          <w:name w:val="Allgemein"/>
+          <w:gallery w:val="placeholder"/>
+        </w:category>
+        <w:types>
+          <w:type w:val="bbPlcHdr"/>
+        </w:types>
+        <w:behaviors>
+          <w:behavior w:val="content"/>
+        </w:behaviors>
+        <w:guid w:val="{12AAE92D-1522-4111-BC2D-2E60854880D9}"/>
+      </w:docPartPr>
+      <w:docPartBody>
+        <w:p>
+          <w:r>
+            <w:rPr>
+              <w:rStyle w:val="Platzhaltertext"/>
+            </w:rPr>
+            <w:t>Klicken oder tippen Sie hier, um Text einzugeben.</w:t>
+          </w:r>
+        </w:p>
+      </w:docPartBody>
+    </w:docPart>
+  </w:docParts>
+</w:glossaryDocument>
+</file>
+
+<file path=word/glossary/fontTable.xml><?xml version="1.0" encoding="utf-8"?>
+<w:fonts xmlns:mc="http://schemas.openxmlformats.org/markup-compatibility/2006" xmlns:r="http://schemas.openxmlformats.org/officeDocument/2006/relationships" xmlns:w="http://schemas.openxmlformats.org/wordprocessingml/2006/main" xmlns:w14="http://schemas.microsoft.com/office/word/2010/wordml" xmlns:w15="http://schemas.microsoft.com/office/word/2012/wordml" xmlns:w16cex="http://schemas.microsoft.com/office/word/2018/wordml/cex" xmlns:w16cid="http://schemas.microsoft.com/office/word/2016/wordml/cid" xmlns:w16="http://schemas.microsoft.com/office/word/2018/wordml" xmlns:w16du="http://schemas.microsoft.com/office/word/2023/wordml/word16du" xmlns:w16sdtdh="http://schemas.microsoft.com/office/word/2020/wordml/sdtdatahash" xmlns:w16sdtfl="http://schemas.microsoft.com/office/word/2024/wordml/sdtformatlock" xmlns:w16se="http://schemas.microsoft.com/office/word/2015/wordml/symex" mc:Ignorable="w14 w15 w16se w16cid w16 w16cex w16sdtdh w16sdtfl w16du">
+  <w:font w:name="Aptos">
+    <w:charset w:val="00"/>
+    <w:family w:val="swiss"/>
+    <w:pitch w:val="variable"/>
+    <w:sig w:usb0="20000287" w:usb1="00000003" w:usb2="00000000" w:usb3="00000000" w:csb0="0000019F" w:csb1="00000000"/>
+  </w:font>
+  <w:font w:name="Arial">
+    <w:panose1 w:val="020B0604020202020204"/>
+    <w:charset w:val="00"/>
+    <w:family w:val="swiss"/>
+    <w:pitch w:val="variable"/>
+    <w:sig w:usb0="E0002EFF" w:usb1="C000785B" w:usb2="00000009" w:usb3="00000000" w:csb0="000001FF" w:csb1="00000000"/>
+  </w:font>
+  <w:font w:name="Aptos Display">
+    <w:charset w:val="00"/>
+    <w:family w:val="swiss"/>
+    <w:pitch w:val="variable"/>
+    <w:sig w:usb0="20000287" w:usb1="00000003" w:usb2="00000000" w:usb3="00000000" w:csb0="0000019F" w:csb1="00000000"/>
+  </w:font>
+  <w:font w:name="Times New Roman">
+    <w:panose1 w:val="02020603050405020304"/>
+    <w:charset w:val="00"/>
+    <w:family w:val="roman"/>
+    <w:pitch w:val="variable"/>
+    <w:sig w:usb0="E0002EFF" w:usb1="C000785B" w:usb2="00000009" w:usb3="00000000" w:csb0="000001FF" w:csb1="00000000"/>
+  </w:font>
+  <w:font w:name="Calibri">
+    <w:panose1 w:val="020F0502020204030204"/>
+    <w:charset w:val="00"/>
+    <w:family w:val="swiss"/>
+    <w:pitch w:val="variable"/>
+    <w:sig w:usb0="E4002EFF" w:usb1="C200247B" w:usb2="00000009" w:usb3="00000000" w:csb0="000001FF" w:csb1="00000000"/>
+  </w:font>
+</w:fonts>
+</file>
+
+<file path=word/glossary/settings.xml><?xml version="1.0" encoding="utf-8"?>
+<w:settings xmlns:mc="http://schemas.openxmlformats.org/markup-compatibility/2006" xmlns:o="urn:schemas-microsoft-com:office:office" xmlns:r="http://schemas.openxmlformats.org/officeDocument/2006/relationships" xmlns:m="http://schemas.openxmlformats.org/officeDocument/2006/math" xmlns:v="urn:schemas-microsoft-com:vml" xmlns:w10="urn:schemas-microsoft-com:office:word" xmlns:w="http://schemas.openxmlformats.org/wordprocessingml/2006/main" xmlns:w14="http://schemas.microsoft.com/office/word/2010/wordml" xmlns:w15="http://schemas.microsoft.com/office/word/2012/wordml" xmlns:w16cex="http://schemas.microsoft.com/office/word/2018/wordml/cex" xmlns:w16cid="http://schemas.microsoft.com/office/word/2016/wordml/cid" xmlns:w16="http://schemas.microsoft.com/office/word/2018/wordml" xmlns:w16du="http://schemas.microsoft.com/office/word/2023/wordml/word16du" xmlns:w16sdtdh="http://schemas.microsoft.com/office/word/2020/wordml/sdtdatahash" xmlns:w16sdtfl="http://schemas.microsoft.com/office/word/2024/wordml/sdtformatlock" xmlns:w16se="http://schemas.microsoft.com/office/word/2015/wordml/symex" xmlns:sl="http://schemas.openxmlformats.org/schemaLibrary/2006/main" mc:Ignorable="w14 w15 w16se w16cid w16 w16cex w16sdtdh w16sdtfl w16du">
+  <w:view w:val="normal"/>
+  <w:defaultTabStop w:val="720"/>
+  <w:characterSpacingControl w:val="doNotCompress"/>
+  <w:compat>
+    <w:useFELayout/>
+    <w:compatSetting w:name="compatibilityMode" w:uri="http://schemas.microsoft.com/office/word" w:val="15"/>
+    <w:compatSetting w:name="overrideTableStyleFontSizeAndJustification" w:uri="http://schemas.microsoft.com/office/word" w:val="1"/>
+    <w:compatSetting w:name="enableOpenTypeFeatures" w:uri="http://schemas.microsoft.com/office/word" w:val="1"/>
+    <w:compatSetting w:name="doNotFlipMirrorIndents" w:uri="http://schemas.microsoft.com/office/word" w:val="1"/>
+    <w:compatSetting w:name="differentiateMultirowTableHeaders" w:uri="http://schemas.microsoft.com/office/word" w:val="1"/>
+    <w:compatSetting w:name="useWord2013TrackBottomHyphenation" w:uri="http://schemas.microsoft.com/office/word" w:val="0"/>
+  </w:compat>
+  <w:rsids>
+    <w:rsidRoot w:val="00F16466"/>
+    <w:rsid w:val="00216B9E"/>
+    <w:rsid w:val="0044697C"/>
+    <w:rsid w:val="00F16466"/>
+  </w:rsids>
+  <m:mathPr>
+    <m:mathFont m:val="Cambria Math"/>
+    <m:brkBin m:val="before"/>
+    <m:brkBinSub m:val="--"/>
+    <m:smallFrac m:val="0"/>
+    <m:dispDef/>
+    <m:lMargin m:val="0"/>
+    <m:rMargin m:val="0"/>
+    <m:defJc m:val="centerGroup"/>
+    <m:wrapIndent m:val="1440"/>
+    <m:intLim m:val="subSup"/>
+    <m:naryLim m:val="undOvr"/>
+  </m:mathPr>
+  <w:themeFontLang w:val="en-US"/>
+  <w:clrSchemeMapping w:bg1="light1" w:t1="dark1" w:bg2="light2" w:t2="dark2" w:accent1="accent1" w:accent2="accent2" w:accent3="accent3" w:accent4="accent4" w:accent5="accent5" w:accent6="accent6" w:hyperlink="hyperlink" w:followedHyperlink="followedHyperlink"/>
+  <w:decimalSymbol w:val=","/>
+  <w:listSeparator w:val=";"/>
+  <w15:chartTrackingRefBased/>
+</w:settings>
+</file>
+
+<file path=word/glossary/styles.xml><?xml version="1.0" encoding="utf-8"?>
+<w:styles xmlns:mc="http://schemas.openxmlformats.org/markup-compatibility/2006" xmlns:r="http://schemas.openxmlformats.org/officeDocument/2006/relationships" xmlns:w="http://schemas.openxmlformats.org/wordprocessingml/2006/main" xmlns:w14="http://schemas.microsoft.com/office/word/2010/wordml" xmlns:w15="http://schemas.microsoft.com/office/word/2012/wordml" xmlns:w16cex="http://schemas.microsoft.com/office/word/2018/wordml/cex" xmlns:w16cid="http://schemas.microsoft.com/office/word/2016/wordml/cid" xmlns:w16="http://schemas.microsoft.com/office/word/2018/wordml" xmlns:w16du="http://schemas.microsoft.com/office/word/2023/wordml/word16du" xmlns:w16sdtdh="http://schemas.microsoft.com/office/word/2020/wordml/sdtdatahash" xmlns:w16sdtfl="http://schemas.microsoft.com/office/word/2024/wordml/sdtformatlock" xmlns:w16se="http://schemas.microsoft.com/office/word/2015/wordml/symex" mc:Ignorable="w14 w15 w16se w16cid w16 w16cex w16sdtdh w16sdtfl w16du">
+  <w:docDefaults>
+    <w:rPrDefault>
+      <w:rPr>
+        <w:rFonts w:asciiTheme="minorHAnsi" w:eastAsiaTheme="minorEastAsia" w:hAnsiTheme="minorHAnsi" w:cstheme="minorBidi"/>
+        <w:kern w:val="2"/>
+        <w:sz w:val="24"/>
+        <w:szCs w:val="24"/>
+        <w:lang w:val="en-US" w:eastAsia="en-US" w:bidi="ar-SA"/>
+        <w14:ligatures w14:val="standardContextual"/>
+      </w:rPr>
+    </w:rPrDefault>
+    <w:pPrDefault>
+      <w:pPr>
+        <w:spacing w:after="160" w:line="278" w:lineRule="auto"/>
+      </w:pPr>
+    </w:pPrDefault>
+  </w:docDefaults>
+  <w:latentStyles w:defLockedState="0" w:defUIPriority="99" w:defSemiHidden="0" w:defUnhideWhenUsed="0" w:defQFormat="0" w:count="376">
+    <w:lsdException w:name="Normal" w:uiPriority="0" w:qFormat="1"/>
+    <w:lsdException w:name="heading 1" w:uiPriority="9" w:qFormat="1"/>
+    <w:lsdException w:name="heading 2" w:semiHidden="1" w:uiPriority="9" w:unhideWhenUsed="1" w:qFormat="1"/>
+    <w:lsdException w:name="heading 3" w:semiHidden="1" w:uiPriority="9" w:unhideWhenUsed="1" w:qFormat="1"/>
+    <w:lsdException w:name="heading 4" w:semiHidden="1" w:uiPriority="9" w:unhideWhenUsed="1" w:qFormat="1"/>
+    <w:lsdException w:name="heading 5" w:semiHidden="1" w:uiPriority="9" w:unhideWhenUsed="1" w:qFormat="1"/>
+    <w:lsdException w:name="heading 6" w:semiHidden="1" w:uiPriority="9" w:unhideWhenUsed="1" w:qFormat="1"/>
+    <w:lsdException w:name="heading 7" w:semiHidden="1" w:uiPriority="9" w:unhideWhenUsed="1" w:qFormat="1"/>
+    <w:lsdException w:name="heading 8" w:semiHidden="1" w:uiPriority="9" w:unhideWhenUsed="1" w:qFormat="1"/>
+    <w:lsdException w:name="heading 9" w:semiHidden="1" w:uiPriority="9" w:unhideWhenUsed="1" w:qFormat="1"/>
+    <w:lsdException w:name="index 1" w:semiHidden="1" w:unhideWhenUsed="1"/>
+    <w:lsdException w:name="index 2" w:semiHidden="1" w:unhideWhenUsed="1"/>
+    <w:lsdException w:name="index 3" w:semiHidden="1" w:unhideWhenUsed="1"/>
+    <w:lsdException w:name="index 4" w:semiHidden="1" w:unhideWhenUsed="1"/>
+    <w:lsdException w:name="index 5" w:semiHidden="1" w:unhideWhenUsed="1"/>
+    <w:lsdException w:name="index 6" w:semiHidden="1" w:unhideWhenUsed="1"/>
+    <w:lsdException w:name="index 7" w:semiHidden="1" w:unhideWhenUsed="1"/>
+    <w:lsdException w:name="index 8" w:semiHidden="1" w:unhideWhenUsed="1"/>
+    <w:lsdException w:name="index 9" w:semiHidden="1" w:unhideWhenUsed="1"/>
+    <w:lsdException w:name="toc 1" w:semiHidden="1" w:uiPriority="39" w:unhideWhenUsed="1"/>
+    <w:lsdException w:name="toc 2" w:semiHidden="1" w:uiPriority="39" w:unhideWhenUsed="1"/>
+    <w:lsdException w:name="toc 3" w:semiHidden="1" w:uiPriority="39" w:unhideWhenUsed="1"/>
+    <w:lsdException w:name="toc 4" w:semiHidden="1" w:uiPriority="39" w:unhideWhenUsed="1"/>
+    <w:lsdException w:name="toc 5" w:semiHidden="1" w:uiPriority="39" w:unhideWhenUsed="1"/>
+    <w:lsdException w:name="toc 6" w:semiHidden="1" w:uiPriority="39" w:unhideWhenUsed="1"/>
+    <w:lsdException w:name="toc 7" w:semiHidden="1" w:uiPriority="39" w:unhideWhenUsed="1"/>
+    <w:lsdException w:name="toc 8" w:semiHidden="1" w:uiPriority="39" w:unhideWhenUsed="1"/>
+    <w:lsdException w:name="toc 9" w:semiHidden="1" w:uiPriority="39" w:unhideWhenUsed="1"/>
+    <w:lsdException w:name="Normal Indent" w:semiHidden="1" w:unhideWhenUsed="1"/>
+    <w:lsdException w:name="footnote text" w:semiHidden="1" w:unhideWhenUsed="1"/>
+    <w:lsdException w:name="annotation text" w:semiHidden="1" w:unhideWhenUsed="1"/>
+    <w:lsdException w:name="header" w:semiHidden="1" w:unhideWhenUsed="1"/>
+    <w:lsdException w:name="footer" w:semiHidden="1" w:unhideWhenUsed="1"/>
+    <w:lsdException w:name="index heading" w:semiHidden="1" w:unhideWhenUsed="1"/>
+    <w:lsdException w:name="caption" w:semiHidden="1" w:uiPriority="35" w:unhideWhenUsed="1" w:qFormat="1"/>
+    <w:lsdException w:name="table of figures" w:semiHidden="1" w:unhideWhenUsed="1"/>
+    <w:lsdException w:name="envelope address" w:semiHidden="1" w:unhideWhenUsed="1"/>
+    <w:lsdException w:name="envelope return" w:semiHidden="1" w:unhideWhenUsed="1"/>
+    <w:lsdException w:name="footnote reference" w:semiHidden="1" w:unhideWhenUsed="1"/>
+    <w:lsdException w:name="annotation reference" w:semiHidden="1" w:unhideWhenUsed="1"/>
+    <w:lsdException w:name="line number" w:semiHidden="1" w:unhideWhenUsed="1"/>
+    <w:lsdException w:name="page number" w:semiHidden="1" w:unhideWhenUsed="1"/>
+    <w:lsdException w:name="endnote reference" w:semiHidden="1" w:unhideWhenUsed="1"/>
+    <w:lsdException w:name="endnote text" w:semiHidden="1" w:unhideWhenUsed="1"/>
+    <w:lsdException w:name="table of authorities" w:semiHidden="1" w:unhideWhenUsed="1"/>
+    <w:lsdException w:name="macro" w:semiHidden="1" w:unhideWhenUsed="1"/>
+    <w:lsdException w:name="toa heading" w:semiHidden="1" w:unhideWhenUsed="1"/>
+    <w:lsdException w:name="List" w:semiHidden="1" w:unhideWhenUsed="1"/>
+    <w:lsdException w:name="List Bullet" w:semiHidden="1" w:unhideWhenUsed="1"/>
+    <w:lsdException w:name="List Number" w:semiHidden="1" w:unhideWhenUsed="1"/>
+    <w:lsdException w:name="List 2" w:semiHidden="1" w:unhideWhenUsed="1"/>
+    <w:lsdException w:name="List 3" w:semiHidden="1" w:unhideWhenUsed="1"/>
+    <w:lsdException w:name="List 4" w:semiHidden="1" w:unhideWhenUsed="1"/>
+    <w:lsdException w:name="List 5" w:semiHidden="1" w:unhideWhenUsed="1"/>
+    <w:lsdException w:name="List Bullet 2" w:semiHidden="1" w:unhideWhenUsed="1"/>
+    <w:lsdException w:name="List Bullet 3" w:semiHidden="1" w:unhideWhenUsed="1"/>
+    <w:lsdException w:name="List Bullet 4" w:semiHidden="1" w:unhideWhenUsed="1"/>
+    <w:lsdException w:name="List Bullet 5" w:semiHidden="1" w:unhideWhenUsed="1"/>
+    <w:lsdException w:name="List Number 2" w:semiHidden="1" w:unhideWhenUsed="1"/>
+    <w:lsdException w:name="List Number 3" w:semiHidden="1" w:unhideWhenUsed="1"/>
+    <w:lsdException w:name="List Number 4" w:semiHidden="1" w:unhideWhenUsed="1"/>
+    <w:lsdException w:name="List Number 5" w:semiHidden="1" w:unhideWhenUsed="1"/>
+    <w:lsdException w:name="Title" w:uiPriority="10" w:qFormat="1"/>
+    <w:lsdException w:name="Closing" w:semiHidden="1" w:unhideWhenUsed="1"/>
+    <w:lsdException w:name="Signature" w:semiHidden="1" w:unhideWhenUsed="1"/>
+    <w:lsdException w:name="Default Paragraph Font" w:semiHidden="1" w:uiPriority="1" w:unhideWhenUsed="1"/>
+    <w:lsdException w:name="Body Text" w:semiHidden="1" w:unhideWhenUsed="1"/>
+    <w:lsdException w:name="Body Text Indent" w:semiHidden="1" w:unhideWhenUsed="1"/>
+    <w:lsdException w:name="List Continue" w:semiHidden="1" w:unhideWhenUsed="1"/>
+    <w:lsdException w:name="List Continue 2" w:semiHidden="1" w:unhideWhenUsed="1"/>
+    <w:lsdException w:name="List Continue 3" w:semiHidden="1" w:unhideWhenUsed="1"/>
+    <w:lsdException w:name="List Continue 4" w:semiHidden="1" w:unhideWhenUsed="1"/>
+    <w:lsdException w:name="List Continue 5" w:semiHidden="1" w:unhideWhenUsed="1"/>
+    <w:lsdException w:name="Message Header" w:semiHidden="1" w:unhideWhenUsed="1"/>
+    <w:lsdException w:name="Subtitle" w:uiPriority="11" w:qFormat="1"/>
+    <w:lsdException w:name="Salutation" w:semiHidden="1" w:unhideWhenUsed="1"/>
+    <w:lsdException w:name="Date" w:semiHidden="1" w:unhideWhenUsed="1"/>
+    <w:lsdException w:name="Body Text First Indent" w:semiHidden="1" w:unhideWhenUsed="1"/>
+    <w:lsdException w:name="Body Text First Indent 2" w:semiHidden="1" w:unhideWhenUsed="1"/>
+    <w:lsdException w:name="Note Heading" w:semiHidden="1" w:unhideWhenUsed="1"/>
+    <w:lsdException w:name="Body Text 2" w:semiHidden="1" w:unhideWhenUsed="1"/>
+    <w:lsdException w:name="Body Text 3" w:semiHidden="1" w:unhideWhenUsed="1"/>
+    <w:lsdException w:name="Body Text Indent 2" w:semiHidden="1" w:unhideWhenUsed="1"/>
+    <w:lsdException w:name="Body Text Indent 3" w:semiHidden="1" w:unhideWhenUsed="1"/>
+    <w:lsdException w:name="Block Text" w:semiHidden="1" w:unhideWhenUsed="1"/>
+    <w:lsdException w:name="Hyperlink" w:semiHidden="1" w:unhideWhenUsed="1"/>
+    <w:lsdException w:name="FollowedHyperlink" w:semiHidden="1" w:unhideWhenUsed="1"/>
+    <w:lsdException w:name="Strong" w:uiPriority="22" w:qFormat="1"/>
+    <w:lsdException w:name="Emphasis" w:uiPriority="20" w:qFormat="1"/>
+    <w:lsdException w:name="Document Map" w:semiHidden="1" w:unhideWhenUsed="1"/>
+    <w:lsdException w:name="Plain Text" w:semiHidden="1" w:unhideWhenUsed="1"/>
+    <w:lsdException w:name="E-mail Signature" w:semiHidden="1" w:unhideWhenUsed="1"/>
+    <w:lsdException w:name="HTML Top of Form" w:semiHidden="1" w:unhideWhenUsed="1"/>
+    <w:lsdException w:name="HTML Bottom of Form" w:semiHidden="1" w:unhideWhenUsed="1"/>
+    <w:lsdException w:name="Normal (Web)" w:semiHidden="1" w:unhideWhenUsed="1"/>
+    <w:lsdException w:name="HTML Acronym" w:semiHidden="1" w:unhideWhenUsed="1"/>
+    <w:lsdException w:name="HTML Address" w:semiHidden="1" w:unhideWhenUsed="1"/>
+    <w:lsdException w:name="HTML Cite" w:semiHidden="1" w:unhideWhenUsed="1"/>
+    <w:lsdException w:name="HTML Code" w:semiHidden="1" w:unhideWhenUsed="1"/>
+    <w:lsdException w:name="HTML Definition" w:semiHidden="1" w:unhideWhenUsed="1"/>
+    <w:lsdException w:name="HTML Keyboard" w:semiHidden="1" w:unhideWhenUsed="1"/>
+    <w:lsdException w:name="HTML Preformatted" w:semiHidden="1" w:unhideWhenUsed="1"/>
+    <w:lsdException w:name="HTML Sample" w:semiHidden="1" w:unhideWhenUsed="1"/>
+    <w:lsdException w:name="HTML Typewriter" w:semiHidden="1" w:unhideWhenUsed="1"/>
+    <w:lsdException w:name="HTML Variable" w:semiHidden="1" w:unhideWhenUsed="1"/>
+    <w:lsdException w:name="Normal Table" w:semiHidden="1" w:unhideWhenUsed="1"/>
+    <w:lsdException w:name="annotation subject" w:semiHidden="1" w:unhideWhenUsed="1"/>
+    <w:lsdException w:name="No List" w:semiHidden="1" w:unhideWhenUsed="1"/>
+    <w:lsdException w:name="Outline List 1" w:semiHidden="1" w:unhideWhenUsed="1"/>
+    <w:lsdException w:name="Outline List 2" w:semiHidden="1" w:unhideWhenUsed="1"/>
+    <w:lsdException w:name="Outline List 3" w:semiHidden="1" w:unhideWhenUsed="1"/>
+    <w:lsdException w:name="Table Simple 1" w:semiHidden="1" w:unhideWhenUsed="1"/>
+    <w:lsdException w:name="Table Simple 2" w:semiHidden="1" w:unhideWhenUsed="1"/>
+    <w:lsdException w:name="Table Simple 3" w:semiHidden="1" w:unhideWhenUsed="1"/>
+    <w:lsdException w:name="Table Classic 1" w:semiHidden="1" w:unhideWhenUsed="1"/>
+    <w:lsdException w:name="Table Classic 2" w:semiHidden="1" w:unhideWhenUsed="1"/>
+    <w:lsdException w:name="Table Classic 3" w:semiHidden="1" w:unhideWhenUsed="1"/>
+    <w:lsdException w:name="Table Classic 4" w:semiHidden="1" w:unhideWhenUsed="1"/>
+    <w:lsdException w:name="Table Colorful 1" w:semiHidden="1" w:unhideWhenUsed="1"/>
+    <w:lsdException w:name="Table Colorful 2" w:semiHidden="1" w:unhideWhenUsed="1"/>
+    <w:lsdException w:name="Table Colorful 3" w:semiHidden="1" w:unhideWhenUsed="1"/>
+    <w:lsdException w:name="Table Columns 1" w:semiHidden="1" w:unhideWhenUsed="1"/>
+    <w:lsdException w:name="Table Columns 2" w:semiHidden="1" w:unhideWhenUsed="1"/>
+    <w:lsdException w:name="Table Columns 3" w:semiHidden="1" w:unhideWhenUsed="1"/>
+    <w:lsdException w:name="Table Columns 4" w:semiHidden="1" w:unhideWhenUsed="1"/>
+    <w:lsdException w:name="Table Columns 5" w:semiHidden="1" w:unhideWhenUsed="1"/>
+    <w:lsdException w:name="Table Grid 1" w:semiHidden="1" w:unhideWhenUsed="1"/>
+    <w:lsdException w:name="Table Grid 2" w:semiHidden="1" w:unhideWhenUsed="1"/>
+    <w:lsdException w:name="Table Grid 3" w:semiHidden="1" w:unhideWhenUsed="1"/>
+    <w:lsdException w:name="Table Grid 4" w:semiHidden="1" w:unhideWhenUsed="1"/>
+    <w:lsdException w:name="Table Grid 5" w:semiHidden="1" w:unhideWhenUsed="1"/>
+    <w:lsdException w:name="Table Grid 6" w:semiHidden="1" w:unhideWhenUsed="1"/>
+    <w:lsdException w:name="Table Grid 7" w:semiHidden="1" w:unhideWhenUsed="1"/>
+    <w:lsdException w:name="Table Grid 8" w:semiHidden="1" w:unhideWhenUsed="1"/>
+    <w:lsdException w:name="Table List 1" w:semiHidden="1" w:unhideWhenUsed="1"/>
+    <w:lsdException w:name="Table List 2" w:semiHidden="1" w:unhideWhenUsed="1"/>
+    <w:lsdException w:name="Table List 3" w:semiHidden="1" w:unhideWhenUsed="1"/>
+    <w:lsdException w:name="Table List 4" w:semiHidden="1" w:unhideWhenUsed="1"/>
+    <w:lsdException w:name="Table List 5" w:semiHidden="1" w:unhideWhenUsed="1"/>
+    <w:lsdException w:name="Table List 6" w:semiHidden="1" w:unhideWhenUsed="1"/>
+    <w:lsdException w:name="Table List 7" w:semiHidden="1" w:unhideWhenUsed="1"/>
+    <w:lsdException w:name="Table List 8" w:semiHidden="1" w:unhideWhenUsed="1"/>
+    <w:lsdException w:name="Table 3D effects 1" w:semiHidden="1" w:unhideWhenUsed="1"/>
+    <w:lsdException w:name="Table 3D effects 2" w:semiHidden="1" w:unhideWhenUsed="1"/>
+    <w:lsdException w:name="Table 3D effects 3" w:semiHidden="1" w:unhideWhenUsed="1"/>
+    <w:lsdException w:name="Table Contemporary" w:semiHidden="1" w:unhideWhenUsed="1"/>
+    <w:lsdException w:name="Table Elegant" w:semiHidden="1" w:unhideWhenUsed="1"/>
+    <w:lsdException w:name="Table Professional" w:semiHidden="1" w:unhideWhenUsed="1"/>
+    <w:lsdException w:name="Table Subtle 1" w:semiHidden="1" w:unhideWhenUsed="1"/>
+    <w:lsdException w:name="Table Subtle 2" w:semiHidden="1" w:unhideWhenUsed="1"/>
+    <w:lsdException w:name="Table Web 1" w:semiHidden="1" w:unhideWhenUsed="1"/>
+    <w:lsdException w:name="Table Web 2" w:semiHidden="1" w:unhideWhenUsed="1"/>
+    <w:lsdException w:name="Table Web 3" w:semiHidden="1" w:unhideWhenUsed="1"/>
+    <w:lsdException w:name="Balloon Text" w:semiHidden="1" w:unhideWhenUsed="1"/>
+    <w:lsdException w:name="Table Grid" w:uiPriority="39"/>
+    <w:lsdException w:name="Table Theme" w:semiHidden="1" w:unhideWhenUsed="1"/>
+    <w:lsdException w:name="Placeholder Text" w:semiHidden="1"/>
+    <w:lsdException w:name="No Spacing" w:uiPriority="1" w:qFormat="1"/>
+    <w:lsdException w:name="Light Shading" w:uiPriority="60"/>
+    <w:lsdException w:name="Light List" w:uiPriority="61"/>
+    <w:lsdException w:name="Light Grid" w:uiPriority="62"/>
+    <w:lsdException w:name="Medium Shading 1" w:uiPriority="63"/>
+    <w:lsdException w:name="Medium Shading 2" w:uiPriority="64"/>
+    <w:lsdException w:name="Medium List 1" w:uiPriority="65"/>
+    <w:lsdException w:name="Medium List 2" w:uiPriority="66"/>
+    <w:lsdException w:name="Medium Grid 1" w:uiPriority="67"/>
+    <w:lsdException w:name="Medium Grid 2" w:uiPriority="68"/>
+    <w:lsdException w:name="Medium Grid 3" w:uiPriority="69"/>
+    <w:lsdException w:name="Dark List" w:uiPriority="70"/>
+    <w:lsdException w:name="Colorful Shading" w:uiPriority="71"/>
+    <w:lsdException w:name="Colorful List" w:uiPriority="72"/>
+    <w:lsdException w:name="Colorful Grid" w:uiPriority="73"/>
+    <w:lsdException w:name="Light Shading Accent 1" w:uiPriority="60"/>
+    <w:lsdException w:name="Light List Accent 1" w:uiPriority="61"/>
+    <w:lsdException w:name="Light Grid Accent 1" w:uiPriority="62"/>
+    <w:lsdException w:name="Medium Shading 1 Accent 1" w:uiPriority="63"/>
+    <w:lsdException w:name="Medium Shading 2 Accent 1" w:uiPriority="64"/>
+    <w:lsdException w:name="Medium List 1 Accent 1" w:uiPriority="65"/>
+    <w:lsdException w:name="Revision" w:semiHidden="1"/>
+    <w:lsdException w:name="List Paragraph" w:uiPriority="34" w:qFormat="1"/>
+    <w:lsdException w:name="Quote" w:uiPriority="29" w:qFormat="1"/>
+    <w:lsdException w:name="Intense Quote" w:uiPriority="30" w:qFormat="1"/>
+    <w:lsdException w:name="Medium List 2 Accent 1" w:uiPriority="66"/>
+    <w:lsdException w:name="Medium Grid 1 Accent 1" w:uiPriority="67"/>
+    <w:lsdException w:name="Medium Grid 2 Accent 1" w:uiPriority="68"/>
+    <w:lsdException w:name="Medium Grid 3 Accent 1" w:uiPriority="69"/>
+    <w:lsdException w:name="Dark List Accent 1" w:uiPriority="70"/>
+    <w:lsdException w:name="Colorful Shading Accent 1" w:uiPriority="71"/>
+    <w:lsdException w:name="Colorful List Accent 1" w:uiPriority="72"/>
+    <w:lsdException w:name="Colorful Grid Accent 1" w:uiPriority="73"/>
+    <w:lsdException w:name="Light Shading Accent 2" w:uiPriority="60"/>
+    <w:lsdException w:name="Light List Accent 2" w:uiPriority="61"/>
+    <w:lsdException w:name="Light Grid Accent 2" w:uiPriority="62"/>
+    <w:lsdException w:name="Medium Shading 1 Accent 2" w:uiPriority="63"/>
+    <w:lsdException w:name="Medium Shading 2 Accent 2" w:uiPriority="64"/>
+    <w:lsdException w:name="Medium List 1 Accent 2" w:uiPriority="65"/>
+    <w:lsdException w:name="Medium List 2 Accent 2" w:uiPriority="66"/>
+    <w:lsdException w:name="Medium Grid 1 Accent 2" w:uiPriority="67"/>
+    <w:lsdException w:name="Medium Grid 2 Accent 2" w:uiPriority="68"/>
+    <w:lsdException w:name="Medium Grid 3 Accent 2" w:uiPriority="69"/>
+    <w:lsdException w:name="Dark List Accent 2" w:uiPriority="70"/>
+    <w:lsdException w:name="Colorful Shading Accent 2" w:uiPriority="71"/>
+    <w:lsdException w:name="Colorful List Accent 2" w:uiPriority="72"/>
+    <w:lsdException w:name="Colorful Grid Accent 2" w:uiPriority="73"/>
+    <w:lsdException w:name="Light Shading Accent 3" w:uiPriority="60"/>
+    <w:lsdException w:name="Light List Accent 3" w:uiPriority="61"/>
+    <w:lsdException w:name="Light Grid Accent 3" w:uiPriority="62"/>
+    <w:lsdException w:name="Medium Shading 1 Accent 3" w:uiPriority="63"/>
+    <w:lsdException w:name="Medium Shading 2 Accent 3" w:uiPriority="64"/>
+    <w:lsdException w:name="Medium List 1 Accent 3" w:uiPriority="65"/>
+    <w:lsdException w:name="Medium List 2 Accent 3" w:uiPriority="66"/>
+    <w:lsdException w:name="Medium Grid 1 Accent 3" w:uiPriority="67"/>
+    <w:lsdException w:name="Medium Grid 2 Accent 3" w:uiPriority="68"/>
+    <w:lsdException w:name="Medium Grid 3 Accent 3" w:uiPriority="69"/>
+    <w:lsdException w:name="Dark List Accent 3" w:uiPriority="70"/>
+    <w:lsdException w:name="Colorful Shading Accent 3" w:uiPriority="71"/>
+    <w:lsdException w:name="Colorful List Accent 3" w:uiPriority="72"/>
+    <w:lsdException w:name="Colorful Grid Accent 3" w:uiPriority="73"/>
+    <w:lsdException w:name="Light Shading Accent 4" w:uiPriority="60"/>
+    <w:lsdException w:name="Light List Accent 4" w:uiPriority="61"/>
+    <w:lsdException w:name="Light Grid Accent 4" w:uiPriority="62"/>
+    <w:lsdException w:name="Medium Shading 1 Accent 4" w:uiPriority="63"/>
+    <w:lsdException w:name="Medium Shading 2 Accent 4" w:uiPriority="64"/>
+    <w:lsdException w:name="Medium List 1 Accent 4" w:uiPriority="65"/>
+    <w:lsdException w:name="Medium List 2 Accent 4" w:uiPriority="66"/>
+    <w:lsdException w:name="Medium Grid 1 Accent 4" w:uiPriority="67"/>
+    <w:lsdException w:name="Medium Grid 2 Accent 4" w:uiPriority="68"/>
+    <w:lsdException w:name="Medium Grid 3 Accent 4" w:uiPriority="69"/>
+    <w:lsdException w:name="Dark List Accent 4" w:uiPriority="70"/>
+    <w:lsdException w:name="Colorful Shading Accent 4" w:uiPriority="71"/>
+    <w:lsdException w:name="Colorful List Accent 4" w:uiPriority="72"/>
+    <w:lsdException w:name="Colorful Grid Accent 4" w:uiPriority="73"/>
+    <w:lsdException w:name="Light Shading Accent 5" w:uiPriority="60"/>
+    <w:lsdException w:name="Light List Accent 5" w:uiPriority="61"/>
+    <w:lsdException w:name="Light Grid Accent 5" w:uiPriority="62"/>
+    <w:lsdException w:name="Medium Shading 1 Accent 5" w:uiPriority="63"/>
+    <w:lsdException w:name="Medium Shading 2 Accent 5" w:uiPriority="64"/>
+    <w:lsdException w:name="Medium List 1 Accent 5" w:uiPriority="65"/>
+    <w:lsdException w:name="Medium List 2 Accent 5" w:uiPriority="66"/>
+    <w:lsdException w:name="Medium Grid 1 Accent 5" w:uiPriority="67"/>
+    <w:lsdException w:name="Medium Grid 2 Accent 5" w:uiPriority="68"/>
+    <w:lsdException w:name="Medium Grid 3 Accent 5" w:uiPriority="69"/>
+    <w:lsdException w:name="Dark List Accent 5" w:uiPriority="70"/>
+    <w:lsdException w:name="Colorful Shading Accent 5" w:uiPriority="71"/>
+    <w:lsdException w:name="Colorful List Accent 5" w:uiPriority="72"/>
+    <w:lsdException w:name="Colorful Grid Accent 5" w:uiPriority="73"/>
+    <w:lsdException w:name="Light Shading Accent 6" w:uiPriority="60"/>
+    <w:lsdException w:name="Light List Accent 6" w:uiPriority="61"/>
+    <w:lsdException w:name="Light Grid Accent 6" w:uiPriority="62"/>
+    <w:lsdException w:name="Medium Shading 1 Accent 6" w:uiPriority="63"/>
+    <w:lsdException w:name="Medium Shading 2 Accent 6" w:uiPriority="64"/>
+    <w:lsdException w:name="Medium List 1 Accent 6" w:uiPriority="65"/>
+    <w:lsdException w:name="Medium List 2 Accent 6" w:uiPriority="66"/>
+    <w:lsdException w:name="Medium Grid 1 Accent 6" w:uiPriority="67"/>
+    <w:lsdException w:name="Medium Grid 2 Accent 6" w:uiPriority="68"/>
+    <w:lsdException w:name="Medium Grid 3 Accent 6" w:uiPriority="69"/>
+    <w:lsdException w:name="Dark List Accent 6" w:uiPriority="70"/>
+    <w:lsdException w:name="Colorful Shading Accent 6" w:uiPriority="71"/>
+    <w:lsdException w:name="Colorful List Accent 6" w:uiPriority="72"/>
+    <w:lsdException w:name="Colorful Grid Accent 6" w:uiPriority="73"/>
+    <w:lsdException w:name="Subtle Emphasis" w:uiPriority="19" w:qFormat="1"/>
+    <w:lsdException w:name="Intense Emphasis" w:uiPriority="21" w:qFormat="1"/>
+    <w:lsdException w:name="Subtle Reference" w:uiPriority="31" w:qFormat="1"/>
+    <w:lsdException w:name="Intense Reference" w:uiPriority="32" w:qFormat="1"/>
+    <w:lsdException w:name="Book Title" w:uiPriority="33" w:qFormat="1"/>
+    <w:lsdException w:name="Bibliography" w:semiHidden="1" w:uiPriority="37" w:unhideWhenUsed="1"/>
+    <w:lsdException w:name="TOC Heading" w:semiHidden="1" w:uiPriority="39" w:unhideWhenUsed="1" w:qFormat="1"/>
+    <w:lsdException w:name="Plain Table 1" w:uiPriority="41"/>
+    <w:lsdException w:name="Plain Table 2" w:uiPriority="42"/>
+    <w:lsdException w:name="Plain Table 3" w:uiPriority="43"/>
+    <w:lsdException w:name="Plain Table 4" w:uiPriority="44"/>
+    <w:lsdException w:name="Plain Table 5" w:uiPriority="45"/>
+    <w:lsdException w:name="Grid Table Light" w:uiPriority="40"/>
+    <w:lsdException w:name="Grid Table 1 Light" w:uiPriority="46"/>
+    <w:lsdException w:name="Grid Table 2" w:uiPriority="47"/>
+    <w:lsdException w:name="Grid Table 3" w:uiPriority="48"/>
+    <w:lsdException w:name="Grid Table 4" w:uiPriority="49"/>
+    <w:lsdException w:name="Grid Table 5 Dark" w:uiPriority="50"/>
+    <w:lsdException w:name="Grid Table 6 Colorful" w:uiPriority="51"/>
+    <w:lsdException w:name="Grid Table 7 Colorful" w:uiPriority="52"/>
+    <w:lsdException w:name="Grid Table 1 Light Accent 1" w:uiPriority="46"/>
+    <w:lsdException w:name="Grid Table 2 Accent 1" w:uiPriority="47"/>
+    <w:lsdException w:name="Grid Table 3 Accent 1" w:uiPriority="48"/>
+    <w:lsdException w:name="Grid Table 4 Accent 1" w:uiPriority="49"/>
+    <w:lsdException w:name="Grid Table 5 Dark Accent 1" w:uiPriority="50"/>
+    <w:lsdException w:name="Grid Table 6 Colorful Accent 1" w:uiPriority="51"/>
+    <w:lsdException w:name="Grid Table 7 Colorful Accent 1" w:uiPriority="52"/>
+    <w:lsdException w:name="Grid Table 1 Light Accent 2" w:uiPriority="46"/>
+    <w:lsdException w:name="Grid Table 2 Accent 2" w:uiPriority="47"/>
+    <w:lsdException w:name="Grid Table 3 Accent 2" w:uiPriority="48"/>
+    <w:lsdException w:name="Grid Table 4 Accent 2" w:uiPriority="49"/>
+    <w:lsdException w:name="Grid Table 5 Dark Accent 2" w:uiPriority="50"/>
+    <w:lsdException w:name="Grid Table 6 Colorful Accent 2" w:uiPriority="51"/>
+    <w:lsdException w:name="Grid Table 7 Colorful Accent 2" w:uiPriority="52"/>
+    <w:lsdException w:name="Grid Table 1 Light Accent 3" w:uiPriority="46"/>
+    <w:lsdException w:name="Grid Table 2 Accent 3" w:uiPriority="47"/>
+    <w:lsdException w:name="Grid Table 3 Accent 3" w:uiPriority="48"/>
+    <w:lsdException w:name="Grid Table 4 Accent 3" w:uiPriority="49"/>
+    <w:lsdException w:name="Grid Table 5 Dark Accent 3" w:uiPriority="50"/>
+    <w:lsdException w:name="Grid Table 6 Colorful Accent 3" w:uiPriority="51"/>
+    <w:lsdException w:name="Grid Table 7 Colorful Accent 3" w:uiPriority="52"/>
+    <w:lsdException w:name="Grid Table 1 Light Accent 4" w:uiPriority="46"/>
+    <w:lsdException w:name="Grid Table 2 Accent 4" w:uiPriority="47"/>
+    <w:lsdException w:name="Grid Table 3 Accent 4" w:uiPriority="48"/>
+    <w:lsdException w:name="Grid Table 4 Accent 4" w:uiPriority="49"/>
+    <w:lsdException w:name="Grid Table 5 Dark Accent 4" w:uiPriority="50"/>
+    <w:lsdException w:name="Grid Table 6 Colorful Accent 4" w:uiPriority="51"/>
+    <w:lsdException w:name="Grid Table 7 Colorful Accent 4" w:uiPriority="52"/>
+    <w:lsdException w:name="Grid Table 1 Light Accent 5" w:uiPriority="46"/>
+    <w:lsdException w:name="Grid Table 2 Accent 5" w:uiPriority="47"/>
+    <w:lsdException w:name="Grid Table 3 Accent 5" w:uiPriority="48"/>
+    <w:lsdException w:name="Grid Table 4 Accent 5" w:uiPriority="49"/>
+    <w:lsdException w:name="Grid Table 5 Dark Accent 5" w:uiPriority="50"/>
+    <w:lsdException w:name="Grid Table 6 Colorful Accent 5" w:uiPriority="51"/>
+    <w:lsdException w:name="Grid Table 7 Colorful Accent 5" w:uiPriority="52"/>
+    <w:lsdException w:name="Grid Table 1 Light Accent 6" w:uiPriority="46"/>
+    <w:lsdException w:name="Grid Table 2 Accent 6" w:uiPriority="47"/>
+    <w:lsdException w:name="Grid Table 3 Accent 6" w:uiPriority="48"/>
+    <w:lsdException w:name="Grid Table 4 Accent 6" w:uiPriority="49"/>
+    <w:lsdException w:name="Grid Table 5 Dark Accent 6" w:uiPriority="50"/>
+    <w:lsdException w:name="Grid Table 6 Colorful Accent 6" w:uiPriority="51"/>
+    <w:lsdException w:name="Grid Table 7 Colorful Accent 6" w:uiPriority="52"/>
+    <w:lsdException w:name="List Table 1 Light" w:uiPriority="46"/>
+    <w:lsdException w:name="List Table 2" w:uiPriority="47"/>
+    <w:lsdException w:name="List Table 3" w:uiPriority="48"/>
+    <w:lsdException w:name="List Table 4" w:uiPriority="49"/>
+    <w:lsdException w:name="List Table 5 Dark" w:uiPriority="50"/>
+    <w:lsdException w:name="List Table 6 Colorful" w:uiPriority="51"/>
+    <w:lsdException w:name="List Table 7 Colorful" w:uiPriority="52"/>
+    <w:lsdException w:name="List Table 1 Light Accent 1" w:uiPriority="46"/>
+    <w:lsdException w:name="List Table 2 Accent 1" w:uiPriority="47"/>
+    <w:lsdException w:name="List Table 3 Accent 1" w:uiPriority="48"/>
+    <w:lsdException w:name="List Table 4 Accent 1" w:uiPriority="49"/>
+    <w:lsdException w:name="List Table 5 Dark Accent 1" w:uiPriority="50"/>
+    <w:lsdException w:name="List Table 6 Colorful Accent 1" w:uiPriority="51"/>
+    <w:lsdException w:name="List Table 7 Colorful Accent 1" w:uiPriority="52"/>
+    <w:lsdException w:name="List Table 1 Light Accent 2" w:uiPriority="46"/>
+    <w:lsdException w:name="List Table 2 Accent 2" w:uiPriority="47"/>
+    <w:lsdException w:name="List Table 3 Accent 2" w:uiPriority="48"/>
+    <w:lsdException w:name="List Table 4 Accent 2" w:uiPriority="49"/>
+    <w:lsdException w:name="List Table 5 Dark Accent 2" w:uiPriority="50"/>
+    <w:lsdException w:name="List Table 6 Colorful Accent 2" w:uiPriority="51"/>
+    <w:lsdException w:name="List Table 7 Colorful Accent 2" w:uiPriority="52"/>
+    <w:lsdException w:name="List Table 1 Light Accent 3" w:uiPriority="46"/>
+    <w:lsdException w:name="List Table 2 Accent 3" w:uiPriority="47"/>
+    <w:lsdException w:name="List Table 3 Accent 3" w:uiPriority="48"/>
+    <w:lsdException w:name="List Table 4 Accent 3" w:uiPriority="49"/>
+    <w:lsdException w:name="List Table 5 Dark Accent 3" w:uiPriority="50"/>
+    <w:lsdException w:name="List Table 6 Colorful Accent 3" w:uiPriority="51"/>
+    <w:lsdException w:name="List Table 7 Colorful Accent 3" w:uiPriority="52"/>
+    <w:lsdException w:name="List Table 1 Light Accent 4" w:uiPriority="46"/>
+    <w:lsdException w:name="List Table 2 Accent 4" w:uiPriority="47"/>
+    <w:lsdException w:name="List Table 3 Accent 4" w:uiPriority="48"/>
+    <w:lsdException w:name="List Table 4 Accent 4" w:uiPriority="49"/>
+    <w:lsdException w:name="List Table 5 Dark Accent 4" w:uiPriority="50"/>
+    <w:lsdException w:name="List Table 6 Colorful Accent 4" w:uiPriority="51"/>
+    <w:lsdException w:name="List Table 7 Colorful Accent 4" w:uiPriority="52"/>
+    <w:lsdException w:name="List Table 1 Light Accent 5" w:uiPriority="46"/>
+    <w:lsdException w:name="List Table 2 Accent 5" w:uiPriority="47"/>
+    <w:lsdException w:name="List Table 3 Accent 5" w:uiPriority="48"/>
+    <w:lsdException w:name="List Table 4 Accent 5" w:uiPriority="49"/>
+    <w:lsdException w:name="List Table 5 Dark Accent 5" w:uiPriority="50"/>
+    <w:lsdException w:name="List Table 6 Colorful Accent 5" w:uiPriority="51"/>
+    <w:lsdException w:name="List Table 7 Colorful Accent 5" w:uiPriority="52"/>
+    <w:lsdException w:name="List Table 1 Light Accent 6" w:uiPriority="46"/>
+    <w:lsdException w:name="List Table 2 Accent 6" w:uiPriority="47"/>
+    <w:lsdException w:name="List Table 3 Accent 6" w:uiPriority="48"/>
+    <w:lsdException w:name="List Table 4 Accent 6" w:uiPriority="49"/>
+    <w:lsdException w:name="List Table 5 Dark Accent 6" w:uiPriority="50"/>
+    <w:lsdException w:name="List Table 6 Colorful Accent 6" w:uiPriority="51"/>
+    <w:lsdException w:name="List Table 7 Colorful Accent 6" w:uiPriority="52"/>
+    <w:lsdException w:name="Mention" w:semiHidden="1" w:unhideWhenUsed="1"/>
+    <w:lsdException w:name="Smart Hyperlink" w:semiHidden="1" w:unhideWhenUsed="1"/>
+    <w:lsdException w:name="Hashtag" w:semiHidden="1" w:unhideWhenUsed="1"/>
+    <w:lsdException w:name="Unresolved Mention" w:semiHidden="1" w:unhideWhenUsed="1"/>
+    <w:lsdException w:name="Smart Link" w:semiHidden="1" w:unhideWhenUsed="1"/>
+  </w:latentStyles>
+  <w:style w:type="paragraph" w:default="1" w:styleId="Standard">
+    <w:name w:val="Normal"/>
+    <w:qFormat/>
+  </w:style>
+  <w:style w:type="character" w:default="1" w:styleId="Absatz-Standardschriftart">
+    <w:name w:val="Default Paragraph Font"/>
+    <w:uiPriority w:val="1"/>
+    <w:semiHidden/>
+    <w:unhideWhenUsed/>
+  </w:style>
+  <w:style w:type="table" w:default="1" w:styleId="NormaleTabelle">
+    <w:name w:val="Normal Table"/>
+    <w:uiPriority w:val="99"/>
+    <w:semiHidden/>
+    <w:unhideWhenUsed/>
+    <w:tblPr>
+      <w:tblInd w:w="0" w:type="dxa"/>
+      <w:tblCellMar>
+        <w:top w:w="0" w:type="dxa"/>
+        <w:left w:w="108" w:type="dxa"/>
+        <w:bottom w:w="0" w:type="dxa"/>
+        <w:right w:w="108" w:type="dxa"/>
+      </w:tblCellMar>
+    </w:tblPr>
+  </w:style>
+  <w:style w:type="numbering" w:default="1" w:styleId="KeineListe">
+    <w:name w:val="No List"/>
+    <w:uiPriority w:val="99"/>
+    <w:semiHidden/>
+    <w:unhideWhenUsed/>
+  </w:style>
+  <w:style w:type="character" w:styleId="Platzhaltertext">
+    <w:name w:val="Placeholder Text"/>
+    <w:basedOn w:val="Absatz-Standardschriftart"/>
+    <w:uiPriority w:val="99"/>
+    <w:semiHidden/>
+    <w:rsid w:val="00F16466"/>
+    <w:rPr>
+      <w:color w:val="666666"/>
+    </w:rPr>
+  </w:style>
+</w:styles>
+</file>
+
+<file path=word/glossary/webSettings.xml><?xml version="1.0" encoding="utf-8"?>
+<w:webSettings xmlns:mc="http://schemas.openxmlformats.org/markup-compatibility/2006" xmlns:r="http://schemas.openxmlformats.org/officeDocument/2006/relationships" xmlns:w="http://schemas.openxmlformats.org/wordprocessingml/2006/main" xmlns:w14="http://schemas.microsoft.com/office/word/2010/wordml" xmlns:w15="http://schemas.microsoft.com/office/word/2012/wordml" xmlns:w16cex="http://schemas.microsoft.com/office/word/2018/wordml/cex" xmlns:w16cid="http://schemas.microsoft.com/office/word/2016/wordml/cid" xmlns:w16="http://schemas.microsoft.com/office/word/2018/wordml" xmlns:w16du="http://schemas.microsoft.com/office/word/2023/wordml/word16du" xmlns:w16sdtdh="http://schemas.microsoft.com/office/word/2020/wordml/sdtdatahash" xmlns:w16sdtfl="http://schemas.microsoft.com/office/word/2024/wordml/sdtformatlock" xmlns:w16se="http://schemas.microsoft.com/office/word/2015/wordml/symex" mc:Ignorable="w14 w15 w16se w16cid w16 w16cex w16sdtdh w16sdtfl w16du">
+  <w:optimizeForBrowser/>
+  <w:allowPNG/>
+</w:webSettings>
 </file>
 
 <file path=word/theme/theme1.xml><?xml version="1.0" encoding="utf-8"?>

</xml_diff>